<commit_message>
fix error end corrupt on export word
</commit_message>
<xml_diff>
--- a/backend/templates/template_rps.docx
+++ b/backend/templates/template_rps.docx
@@ -2,458 +2,6 @@
 <file path=word/document.xml><?xml version="1.0" encoding="utf-8"?>
 <w:document xmlns:wpc="http://schemas.microsoft.com/office/word/2010/wordprocessingCanvas" xmlns:cx="http://schemas.microsoft.com/office/drawing/2014/chartex" xmlns:cx1="http://schemas.microsoft.com/office/drawing/2015/9/8/chartex" xmlns:cx2="http://schemas.microsoft.com/office/drawing/2015/10/21/chartex" xmlns:cx3="http://schemas.microsoft.com/office/drawing/2016/5/9/chartex" xmlns:cx4="http://schemas.microsoft.com/office/drawing/2016/5/10/chartex" xmlns:cx5="http://schemas.microsoft.com/office/drawing/2016/5/11/chartex" xmlns:cx6="http://schemas.microsoft.com/office/drawing/2016/5/12/chartex" xmlns:cx7="http://schemas.microsoft.com/office/drawing/2016/5/13/chartex" xmlns:cx8="http://schemas.microsoft.com/office/drawing/2016/5/14/chartex" xmlns:mc="http://schemas.openxmlformats.org/markup-compatibility/2006" xmlns:aink="http://schemas.microsoft.com/office/drawing/2016/ink" xmlns:am3d="http://schemas.microsoft.com/office/drawing/2017/model3d" xmlns:o="urn:schemas-microsoft-com:office:office" xmlns:oel="http://schemas.microsoft.com/office/2019/extlst" xmlns:r="http://schemas.openxmlformats.org/officeDocument/2006/relationships" xmlns:m="http://schemas.openxmlformats.org/officeDocument/2006/math" xmlns:v="urn:schemas-microsoft-com:vml" xmlns:wp14="http://schemas.microsoft.com/office/word/2010/wordprocessingDrawing" xmlns:wp="http://schemas.openxmlformats.org/drawingml/2006/wordprocessingDrawing" xmlns:w10="urn:schemas-microsoft-com:office:word" xmlns:w="http://schemas.openxmlformats.org/wordprocessingml/2006/main" xmlns:w14="http://schemas.microsoft.com/office/word/2010/wordml" xmlns:w15="http://schemas.microsoft.com/office/word/2012/wordml" xmlns:w16cex="http://schemas.microsoft.com/office/word/2018/wordml/cex" xmlns:w16cid="http://schemas.microsoft.com/office/word/2016/wordml/cid" xmlns:w16="http://schemas.microsoft.com/office/word/2018/wordml" xmlns:w16du="http://schemas.microsoft.com/office/word/2023/wordml/word16du" xmlns:w16sdtdh="http://schemas.microsoft.com/office/word/2020/wordml/sdtdatahash" xmlns:w16sdtfl="http://schemas.microsoft.com/office/word/2024/wordml/sdtformatlock" xmlns:w16se="http://schemas.microsoft.com/office/word/2015/wordml/symex" xmlns:wpg="http://schemas.microsoft.com/office/word/2010/wordprocessingGroup" xmlns:wpi="http://schemas.microsoft.com/office/word/2010/wordprocessingInk" xmlns:wne="http://schemas.microsoft.com/office/word/2006/wordml" xmlns:wps="http://schemas.microsoft.com/office/word/2010/wordprocessingShape" mc:Ignorable="w14 w15 w16se w16cid w16 w16cex w16sdtdh w16sdtfl w16du wp14">
   <w:body>
-    <w:p>
-      <w:pPr>
-        <w:pStyle w:val="BodyText"/>
-      </w:pPr>
-      <w:r>
-        <w:rPr>
-          <w:noProof/>
-        </w:rPr>
-        <mc:AlternateContent>
-          <mc:Choice Requires="wps">
-            <w:drawing>
-              <wp:anchor distT="0" distB="0" distL="0" distR="0" simplePos="0" relativeHeight="15728640" behindDoc="0" locked="0" layoutInCell="1" allowOverlap="1" wp14:anchorId="695D0F39" wp14:editId="321DEE07">
-                <wp:simplePos x="0" y="0"/>
-                <wp:positionH relativeFrom="page">
-                  <wp:posOffset>2295524</wp:posOffset>
-                </wp:positionH>
-                <wp:positionV relativeFrom="page">
-                  <wp:posOffset>7362824</wp:posOffset>
-                </wp:positionV>
-                <wp:extent cx="4505325" cy="484505"/>
-                <wp:effectExtent l="0" t="0" r="0" b="0"/>
-                <wp:wrapNone/>
-                <wp:docPr id="5" name="Textbox 5"/>
-                <wp:cNvGraphicFramePr>
-                  <a:graphicFrameLocks xmlns:a="http://schemas.openxmlformats.org/drawingml/2006/main"/>
-                </wp:cNvGraphicFramePr>
-                <a:graphic xmlns:a="http://schemas.openxmlformats.org/drawingml/2006/main">
-                  <a:graphicData uri="http://schemas.microsoft.com/office/word/2010/wordprocessingShape">
-                    <wps:wsp>
-                      <wps:cNvSpPr txBox="1">
-                        <a:spLocks/>
-                      </wps:cNvSpPr>
-                      <wps:spPr>
-                        <a:xfrm>
-                          <a:off x="0" y="0"/>
-                          <a:ext cx="4505325" cy="484505"/>
-                        </a:xfrm>
-                        <a:prstGeom prst="rect">
-                          <a:avLst/>
-                        </a:prstGeom>
-                      </wps:spPr>
-                      <wps:txbx>
-                        <w:txbxContent>
-                          <w:tbl>
-                            <w:tblPr>
-                              <w:tblW w:w="0" w:type="auto"/>
-                              <w:tblInd w:w="67" w:type="dxa"/>
-                              <w:tblBorders>
-                                <w:top w:val="single" w:sz="6" w:space="0" w:color="000000"/>
-                                <w:left w:val="single" w:sz="6" w:space="0" w:color="000000"/>
-                                <w:bottom w:val="single" w:sz="6" w:space="0" w:color="000000"/>
-                                <w:right w:val="single" w:sz="6" w:space="0" w:color="000000"/>
-                                <w:insideH w:val="single" w:sz="6" w:space="0" w:color="000000"/>
-                                <w:insideV w:val="single" w:sz="6" w:space="0" w:color="000000"/>
-                              </w:tblBorders>
-                              <w:tblLayout w:type="fixed"/>
-                              <w:tblCellMar>
-                                <w:left w:w="0" w:type="dxa"/>
-                                <w:right w:w="0" w:type="dxa"/>
-                              </w:tblCellMar>
-                              <w:tblLook w:val="01E0" w:firstRow="1" w:lastRow="1" w:firstColumn="1" w:lastColumn="1" w:noHBand="0" w:noVBand="0"/>
-                            </w:tblPr>
-                            <w:tblGrid>
-                              <w:gridCol w:w="4350"/>
-                              <w:gridCol w:w="2610"/>
-                            </w:tblGrid>
-                            <w:tr>
-                              <w:trPr>
-                                <w:trHeight w:val="359"/>
-                              </w:trPr>
-                              <w:tc>
-                                <w:tcPr>
-                                  <w:tcW w:w="4350" w:type="dxa"/>
-                                </w:tcPr>
-                                <w:p>
-                                  <w:pPr>
-                                    <w:pStyle w:val="TableParagraph"/>
-                                    <w:spacing w:before="53"/>
-                                    <w:ind w:left="24"/>
-                                    <w:jc w:val="center"/>
-                                    <w:rPr>
-                                      <w:sz w:val="20"/>
-                                    </w:rPr>
-                                  </w:pPr>
-                                  <w:r>
-                                    <w:rPr>
-                                      <w:spacing w:val="-4"/>
-                                      <w:sz w:val="20"/>
-                                    </w:rPr>
-                                    <w:t>CPMK</w:t>
-                                  </w:r>
-                                </w:p>
-                              </w:tc>
-                              <w:tc>
-                                <w:tcPr>
-                                  <w:tcW w:w="2610" w:type="dxa"/>
-                                </w:tcPr>
-                                <w:p>
-                                  <w:pPr>
-                                    <w:pStyle w:val="TableParagraph"/>
-                                    <w:spacing w:before="53"/>
-                                    <w:ind w:left="22"/>
-                                    <w:jc w:val="center"/>
-                                    <w:rPr>
-                                      <w:sz w:val="20"/>
-                                    </w:rPr>
-                                  </w:pPr>
-                                  <w:r>
-                                    <w:rPr>
-                                      <w:sz w:val="20"/>
-                                    </w:rPr>
-                                    <w:t>S-{{add</w:t>
-                                  </w:r>
-                                  <w:r>
-                                    <w:rPr>
-                                      <w:spacing w:val="-1"/>
-                                      <w:sz w:val="20"/>
-                                    </w:rPr>
-                                    <w:t xml:space="preserve"> </w:t>
-                                  </w:r>
-                                  <w:r>
-                                    <w:rPr>
-                                      <w:sz w:val="20"/>
-                                    </w:rPr>
-                                    <w:t>$index</w:t>
-                                  </w:r>
-                                  <w:r>
-                                    <w:rPr>
-                                      <w:spacing w:val="-1"/>
-                                      <w:sz w:val="20"/>
-                                    </w:rPr>
-                                    <w:t xml:space="preserve"> </w:t>
-                                  </w:r>
-                                  <w:r>
-                                    <w:rPr>
-                                      <w:spacing w:val="-5"/>
-                                      <w:sz w:val="20"/>
-                                    </w:rPr>
-                                    <w:t>1}}</w:t>
-                                  </w:r>
-                                </w:p>
-                              </w:tc>
-                            </w:tr>
-                            <w:tr>
-                              <w:trPr>
-                                <w:trHeight w:val="359"/>
-                              </w:trPr>
-                              <w:tc>
-                                <w:tcPr>
-                                  <w:tcW w:w="4350" w:type="dxa"/>
-                                </w:tcPr>
-                                <w:p>
-                                  <w:pPr>
-                                    <w:pStyle w:val="TableParagraph"/>
-                                    <w:spacing w:before="53"/>
-                                    <w:ind w:left="24"/>
-                                    <w:jc w:val="center"/>
-                                    <w:rPr>
-                                      <w:b/>
-                                      <w:sz w:val="20"/>
-                                    </w:rPr>
-                                  </w:pPr>
-                                  <w:r>
-                                    <w:rPr>
-                                      <w:b/>
-                                      <w:spacing w:val="-2"/>
-                                      <w:sz w:val="20"/>
-                                    </w:rPr>
-                                    <w:t>{{.CPMKKode}}</w:t>
-                                  </w:r>
-                                </w:p>
-                              </w:tc>
-                              <w:tc>
-                                <w:tcPr>
-                                  <w:tcW w:w="2610" w:type="dxa"/>
-                                </w:tcPr>
-                                <w:p>
-                                  <w:pPr>
-                                    <w:pStyle w:val="TableParagraph"/>
-                                    <w:spacing w:before="24"/>
-                                    <w:ind w:left="22"/>
-                                    <w:jc w:val="center"/>
-                                    <w:rPr>
-                                      <w:sz w:val="20"/>
-                                    </w:rPr>
-                                  </w:pPr>
-                                  <w:r>
-                                    <w:rPr>
-                                      <w:sz w:val="20"/>
-                                    </w:rPr>
-                                    <w:t>{{if</w:t>
-                                  </w:r>
-                                  <w:r>
-                                    <w:rPr>
-                                      <w:spacing w:val="-1"/>
-                                      <w:sz w:val="20"/>
-                                    </w:rPr>
-                                    <w:t xml:space="preserve"> </w:t>
-                                  </w:r>
-                                  <w:r>
-                                    <w:rPr>
-                                      <w:spacing w:val="-2"/>
-                                      <w:sz w:val="20"/>
-                                    </w:rPr>
-                                    <w:t>.}}</w:t>
-                                  </w:r>
-                                  <w:r>
-                                    <w:rPr>
-                                      <w:rFonts w:ascii="Segoe UI Symbol" w:hAnsi="Segoe UI Symbol"/>
-                                      <w:spacing w:val="-2"/>
-                                      <w:sz w:val="20"/>
-                                    </w:rPr>
-                                    <w:t>✓</w:t>
-                                  </w:r>
-                                  <w:r>
-                                    <w:rPr>
-                                      <w:spacing w:val="-2"/>
-                                      <w:sz w:val="20"/>
-                                    </w:rPr>
-                                    <w:t>{{end}}</w:t>
-                                  </w:r>
-                                </w:p>
-                              </w:tc>
-                            </w:tr>
-                          </w:tbl>
-                          <w:p>
-                            <w:pPr>
-                              <w:pStyle w:val="BodyText"/>
-                            </w:pPr>
-                          </w:p>
-                        </w:txbxContent>
-                      </wps:txbx>
-                      <wps:bodyPr wrap="square" lIns="0" tIns="0" rIns="0" bIns="0" rtlCol="0">
-                        <a:noAutofit/>
-                      </wps:bodyPr>
-                    </wps:wsp>
-                  </a:graphicData>
-                </a:graphic>
-              </wp:anchor>
-            </w:drawing>
-          </mc:Choice>
-          <mc:Fallback>
-            <w:pict>
-              <v:shapetype w14:anchorId="695D0F39" id="_x0000_t202" coordsize="21600,21600" o:spt="202" path="m,l,21600r21600,l21600,xe">
-                <v:stroke joinstyle="miter"/>
-                <v:path gradientshapeok="t" o:connecttype="rect"/>
-              </v:shapetype>
-              <v:shape id="Textbox 5" o:spid="_x0000_s1026" type="#_x0000_t202" style="position:absolute;margin-left:180.75pt;margin-top:579.75pt;width:354.75pt;height:38.15pt;z-index:15728640;visibility:visible;mso-wrap-style:square;mso-wrap-distance-left:0;mso-wrap-distance-top:0;mso-wrap-distance-right:0;mso-wrap-distance-bottom:0;mso-position-horizontal:absolute;mso-position-horizontal-relative:page;mso-position-vertical:absolute;mso-position-vertical-relative:page;v-text-anchor:top" o:gfxdata="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" filled="f" stroked="f">
-                <v:textbox inset="0,0,0,0">
-                  <w:txbxContent>
-                    <w:tbl>
-                      <w:tblPr>
-                        <w:tblW w:w="0" w:type="auto"/>
-                        <w:tblInd w:w="67" w:type="dxa"/>
-                        <w:tblBorders>
-                          <w:top w:val="single" w:sz="6" w:space="0" w:color="000000"/>
-                          <w:left w:val="single" w:sz="6" w:space="0" w:color="000000"/>
-                          <w:bottom w:val="single" w:sz="6" w:space="0" w:color="000000"/>
-                          <w:right w:val="single" w:sz="6" w:space="0" w:color="000000"/>
-                          <w:insideH w:val="single" w:sz="6" w:space="0" w:color="000000"/>
-                          <w:insideV w:val="single" w:sz="6" w:space="0" w:color="000000"/>
-                        </w:tblBorders>
-                        <w:tblLayout w:type="fixed"/>
-                        <w:tblCellMar>
-                          <w:left w:w="0" w:type="dxa"/>
-                          <w:right w:w="0" w:type="dxa"/>
-                        </w:tblCellMar>
-                        <w:tblLook w:val="01E0" w:firstRow="1" w:lastRow="1" w:firstColumn="1" w:lastColumn="1" w:noHBand="0" w:noVBand="0"/>
-                      </w:tblPr>
-                      <w:tblGrid>
-                        <w:gridCol w:w="4350"/>
-                        <w:gridCol w:w="2610"/>
-                      </w:tblGrid>
-                      <w:tr>
-                        <w:trPr>
-                          <w:trHeight w:val="359"/>
-                        </w:trPr>
-                        <w:tc>
-                          <w:tcPr>
-                            <w:tcW w:w="4350" w:type="dxa"/>
-                          </w:tcPr>
-                          <w:p>
-                            <w:pPr>
-                              <w:pStyle w:val="TableParagraph"/>
-                              <w:spacing w:before="53"/>
-                              <w:ind w:left="24"/>
-                              <w:jc w:val="center"/>
-                              <w:rPr>
-                                <w:sz w:val="20"/>
-                              </w:rPr>
-                            </w:pPr>
-                            <w:r>
-                              <w:rPr>
-                                <w:spacing w:val="-4"/>
-                                <w:sz w:val="20"/>
-                              </w:rPr>
-                              <w:t>CPMK</w:t>
-                            </w:r>
-                          </w:p>
-                        </w:tc>
-                        <w:tc>
-                          <w:tcPr>
-                            <w:tcW w:w="2610" w:type="dxa"/>
-                          </w:tcPr>
-                          <w:p>
-                            <w:pPr>
-                              <w:pStyle w:val="TableParagraph"/>
-                              <w:spacing w:before="53"/>
-                              <w:ind w:left="22"/>
-                              <w:jc w:val="center"/>
-                              <w:rPr>
-                                <w:sz w:val="20"/>
-                              </w:rPr>
-                            </w:pPr>
-                            <w:r>
-                              <w:rPr>
-                                <w:sz w:val="20"/>
-                              </w:rPr>
-                              <w:t>S-{{add</w:t>
-                            </w:r>
-                            <w:r>
-                              <w:rPr>
-                                <w:spacing w:val="-1"/>
-                                <w:sz w:val="20"/>
-                              </w:rPr>
-                              <w:t xml:space="preserve"> </w:t>
-                            </w:r>
-                            <w:r>
-                              <w:rPr>
-                                <w:sz w:val="20"/>
-                              </w:rPr>
-                              <w:t>$index</w:t>
-                            </w:r>
-                            <w:r>
-                              <w:rPr>
-                                <w:spacing w:val="-1"/>
-                                <w:sz w:val="20"/>
-                              </w:rPr>
-                              <w:t xml:space="preserve"> </w:t>
-                            </w:r>
-                            <w:r>
-                              <w:rPr>
-                                <w:spacing w:val="-5"/>
-                                <w:sz w:val="20"/>
-                              </w:rPr>
-                              <w:t>1}}</w:t>
-                            </w:r>
-                          </w:p>
-                        </w:tc>
-                      </w:tr>
-                      <w:tr>
-                        <w:trPr>
-                          <w:trHeight w:val="359"/>
-                        </w:trPr>
-                        <w:tc>
-                          <w:tcPr>
-                            <w:tcW w:w="4350" w:type="dxa"/>
-                          </w:tcPr>
-                          <w:p>
-                            <w:pPr>
-                              <w:pStyle w:val="TableParagraph"/>
-                              <w:spacing w:before="53"/>
-                              <w:ind w:left="24"/>
-                              <w:jc w:val="center"/>
-                              <w:rPr>
-                                <w:b/>
-                                <w:sz w:val="20"/>
-                              </w:rPr>
-                            </w:pPr>
-                            <w:r>
-                              <w:rPr>
-                                <w:b/>
-                                <w:spacing w:val="-2"/>
-                                <w:sz w:val="20"/>
-                              </w:rPr>
-                              <w:t>{{.CPMKKode}}</w:t>
-                            </w:r>
-                          </w:p>
-                        </w:tc>
-                        <w:tc>
-                          <w:tcPr>
-                            <w:tcW w:w="2610" w:type="dxa"/>
-                          </w:tcPr>
-                          <w:p>
-                            <w:pPr>
-                              <w:pStyle w:val="TableParagraph"/>
-                              <w:spacing w:before="24"/>
-                              <w:ind w:left="22"/>
-                              <w:jc w:val="center"/>
-                              <w:rPr>
-                                <w:sz w:val="20"/>
-                              </w:rPr>
-                            </w:pPr>
-                            <w:r>
-                              <w:rPr>
-                                <w:sz w:val="20"/>
-                              </w:rPr>
-                              <w:t>{{if</w:t>
-                            </w:r>
-                            <w:r>
-                              <w:rPr>
-                                <w:spacing w:val="-1"/>
-                                <w:sz w:val="20"/>
-                              </w:rPr>
-                              <w:t xml:space="preserve"> </w:t>
-                            </w:r>
-                            <w:r>
-                              <w:rPr>
-                                <w:spacing w:val="-2"/>
-                                <w:sz w:val="20"/>
-                              </w:rPr>
-                              <w:t>.}}</w:t>
-                            </w:r>
-                            <w:r>
-                              <w:rPr>
-                                <w:rFonts w:ascii="Segoe UI Symbol" w:hAnsi="Segoe UI Symbol"/>
-                                <w:spacing w:val="-2"/>
-                                <w:sz w:val="20"/>
-                              </w:rPr>
-                              <w:t>✓</w:t>
-                            </w:r>
-                            <w:r>
-                              <w:rPr>
-                                <w:spacing w:val="-2"/>
-                                <w:sz w:val="20"/>
-                              </w:rPr>
-                              <w:t>{{end}}</w:t>
-                            </w:r>
-                          </w:p>
-                        </w:tc>
-                      </w:tr>
-                    </w:tbl>
-                    <w:p>
-                      <w:pPr>
-                        <w:pStyle w:val="BodyText"/>
-                      </w:pPr>
-                    </w:p>
-                  </w:txbxContent>
-                </v:textbox>
-                <w10:wrap anchorx="page" anchory="page"/>
-              </v:shape>
-            </w:pict>
-          </mc:Fallback>
-        </mc:AlternateContent>
-      </w:r>
-    </w:p>
-    <w:p>
-      <w:pPr>
-        <w:pStyle w:val="BodyText"/>
-        <w:spacing w:before="191"/>
-      </w:pPr>
-    </w:p>
     <w:p>
       <w:pPr>
         <w:pStyle w:val="Heading1"/>
@@ -896,18 +444,19 @@
             <w:tcW w:w="2400" w:type="dxa"/>
             <w:gridSpan w:val="2"/>
             <w:shd w:val="clear" w:color="auto" w:fill="D9D9D9" w:themeFill="background1" w:themeFillShade="D9"/>
-          </w:tcPr>
-          <w:p>
-            <w:pPr>
-              <w:pStyle w:val="TableParagraph"/>
-              <w:ind w:left="124"/>
-              <w:rPr>
-                <w:sz w:val="20"/>
-              </w:rPr>
-            </w:pPr>
-            <w:r>
-              <w:rPr>
-                <w:spacing w:val="-2"/>
+            <w:vAlign w:val="center"/>
+          </w:tcPr>
+          <w:p>
+            <w:pPr>
+              <w:pStyle w:val="TableParagraph"/>
+              <w:ind w:left="0"/>
+              <w:jc w:val="center"/>
+              <w:rPr>
+                <w:sz w:val="20"/>
+              </w:rPr>
+            </w:pPr>
+            <w:r>
+              <w:rPr>
                 <w:sz w:val="20"/>
               </w:rPr>
               <w:t>{{.NamaMataKuliah}}</w:t>
@@ -917,117 +466,88 @@
         <w:tc>
           <w:tcPr>
             <w:tcW w:w="975" w:type="dxa"/>
+            <w:vAlign w:val="center"/>
           </w:tcPr>
           <w:p>
             <w:pPr>
               <w:pStyle w:val="TableParagraph"/>
               <w:spacing w:line="312" w:lineRule="auto"/>
-              <w:ind w:left="230" w:right="129" w:hanging="81"/>
-              <w:rPr>
-                <w:sz w:val="20"/>
-              </w:rPr>
-            </w:pPr>
-            <w:r>
-              <w:rPr>
-                <w:spacing w:val="-2"/>
-                <w:sz w:val="20"/>
-              </w:rPr>
-              <w:t xml:space="preserve">{{.Kode </w:t>
-            </w:r>
-            <w:r>
-              <w:rPr>
-                <w:spacing w:val="-4"/>
-                <w:sz w:val="20"/>
-              </w:rPr>
-              <w:t>MK}}</w:t>
+              <w:ind w:left="0" w:right="129"/>
+              <w:jc w:val="center"/>
+              <w:rPr>
+                <w:sz w:val="20"/>
+              </w:rPr>
+            </w:pPr>
+            <w:r>
+              <w:rPr>
+                <w:sz w:val="20"/>
+              </w:rPr>
+              <w:t>{{.KodeMK}}</w:t>
             </w:r>
           </w:p>
         </w:tc>
         <w:tc>
           <w:tcPr>
             <w:tcW w:w="1440" w:type="dxa"/>
+            <w:vAlign w:val="center"/>
           </w:tcPr>
           <w:p>
             <w:pPr>
               <w:pStyle w:val="TableParagraph"/>
               <w:spacing w:line="312" w:lineRule="auto"/>
-              <w:ind w:left="548" w:hanging="387"/>
-              <w:rPr>
-                <w:sz w:val="20"/>
-              </w:rPr>
-            </w:pPr>
-            <w:r>
-              <w:rPr>
-                <w:spacing w:val="-2"/>
-                <w:sz w:val="20"/>
-              </w:rPr>
-              <w:t xml:space="preserve">{{.RumpunM </w:t>
-            </w:r>
-            <w:r>
-              <w:rPr>
-                <w:spacing w:val="-4"/>
-                <w:sz w:val="20"/>
-              </w:rPr>
-              <w:t>K}}</w:t>
+              <w:ind w:left="0"/>
+              <w:jc w:val="center"/>
+              <w:rPr>
+                <w:sz w:val="20"/>
+              </w:rPr>
+            </w:pPr>
+            <w:r>
+              <w:rPr>
+                <w:sz w:val="20"/>
+              </w:rPr>
+              <w:t>{{.RumpunMK}}</w:t>
             </w:r>
           </w:p>
         </w:tc>
         <w:tc>
           <w:tcPr>
             <w:tcW w:w="1440" w:type="dxa"/>
-          </w:tcPr>
-          <w:p>
-            <w:pPr>
-              <w:pStyle w:val="TableParagraph"/>
-              <w:ind w:left="19"/>
-              <w:jc w:val="center"/>
-              <w:rPr>
-                <w:sz w:val="20"/>
-              </w:rPr>
-            </w:pPr>
-            <w:r>
-              <w:rPr>
-                <w:spacing w:val="-2"/>
-                <w:sz w:val="20"/>
-              </w:rPr>
-              <w:t>{{.BobotSKS</w:t>
-            </w:r>
-          </w:p>
+            <w:vAlign w:val="center"/>
+          </w:tcPr>
           <w:p>
             <w:pPr>
               <w:pStyle w:val="TableParagraph"/>
               <w:spacing w:before="70"/>
-              <w:ind w:left="19"/>
-              <w:jc w:val="center"/>
-              <w:rPr>
-                <w:sz w:val="20"/>
-              </w:rPr>
-            </w:pPr>
-            <w:r>
-              <w:rPr>
-                <w:spacing w:val="-5"/>
-                <w:sz w:val="20"/>
-              </w:rPr>
-              <w:t>}}</w:t>
+              <w:ind w:left="0"/>
+              <w:jc w:val="center"/>
+              <w:rPr>
+                <w:sz w:val="20"/>
+              </w:rPr>
+            </w:pPr>
+            <w:r>
+              <w:rPr>
+                <w:sz w:val="20"/>
+              </w:rPr>
+              <w:t>{{.BobotSKS}}</w:t>
             </w:r>
           </w:p>
         </w:tc>
         <w:tc>
           <w:tcPr>
             <w:tcW w:w="1455" w:type="dxa"/>
+            <w:vAlign w:val="center"/>
           </w:tcPr>
           <w:p>
             <w:pPr>
               <w:pStyle w:val="TableParagraph"/>
               <w:ind w:left="0" w:right="126"/>
-              <w:jc w:val="right"/>
-              <w:rPr>
-                <w:sz w:val="20"/>
-              </w:rPr>
-            </w:pPr>
-            <w:r>
-              <w:rPr>
-                <w:spacing w:val="-2"/>
+              <w:jc w:val="center"/>
+              <w:rPr>
+                <w:sz w:val="20"/>
+              </w:rPr>
+            </w:pPr>
+            <w:r>
+              <w:rPr>
                 <w:sz w:val="20"/>
               </w:rPr>
               <w:t>{{.Semester}}</w:t>
@@ -1037,40 +557,23 @@
         <w:tc>
           <w:tcPr>
             <w:tcW w:w="1920" w:type="dxa"/>
-          </w:tcPr>
-          <w:p>
-            <w:pPr>
-              <w:pStyle w:val="TableParagraph"/>
-              <w:ind w:left="13"/>
-              <w:jc w:val="center"/>
-              <w:rPr>
-                <w:sz w:val="20"/>
-              </w:rPr>
-            </w:pPr>
-            <w:r>
-              <w:rPr>
-                <w:spacing w:val="-2"/>
-                <w:sz w:val="20"/>
-              </w:rPr>
-              <w:t>{{.TglPenyusunan}</w:t>
-            </w:r>
-          </w:p>
+            <w:vAlign w:val="center"/>
+          </w:tcPr>
           <w:p>
             <w:pPr>
               <w:pStyle w:val="TableParagraph"/>
               <w:spacing w:before="70"/>
-              <w:ind w:left="13"/>
-              <w:jc w:val="center"/>
-              <w:rPr>
-                <w:sz w:val="20"/>
-              </w:rPr>
-            </w:pPr>
-            <w:r>
-              <w:rPr>
-                <w:spacing w:val="-10"/>
-                <w:sz w:val="20"/>
-              </w:rPr>
-              <w:t>}</w:t>
+              <w:ind w:left="0"/>
+              <w:jc w:val="center"/>
+              <w:rPr>
+                <w:sz w:val="20"/>
+              </w:rPr>
+            </w:pPr>
+            <w:r>
+              <w:rPr>
+                <w:sz w:val="20"/>
+              </w:rPr>
+              <w:t>{{.TglPenyusunan}}</w:t>
             </w:r>
           </w:p>
         </w:tc>
@@ -1084,11 +587,13 @@
             <w:tcW w:w="2400" w:type="dxa"/>
             <w:gridSpan w:val="2"/>
             <w:shd w:val="clear" w:color="auto" w:fill="D9D9D9" w:themeFill="background1" w:themeFillShade="D9"/>
-          </w:tcPr>
-          <w:p>
-            <w:pPr>
-              <w:pStyle w:val="TableParagraph"/>
-              <w:ind w:left="461"/>
+            <w:vAlign w:val="center"/>
+          </w:tcPr>
+          <w:p>
+            <w:pPr>
+              <w:pStyle w:val="TableParagraph"/>
+              <w:ind w:left="0"/>
+              <w:jc w:val="center"/>
               <w:rPr>
                 <w:sz w:val="20"/>
               </w:rPr>
@@ -1118,12 +623,13 @@
         <w:tc>
           <w:tcPr>
             <w:tcW w:w="975" w:type="dxa"/>
+            <w:vAlign w:val="center"/>
           </w:tcPr>
           <w:p>
             <w:pPr>
               <w:pStyle w:val="TableParagraph"/>
               <w:spacing w:line="312" w:lineRule="auto"/>
-              <w:ind w:left="142" w:right="125"/>
+              <w:ind w:left="0" w:right="125"/>
               <w:jc w:val="center"/>
               <w:rPr>
                 <w:sz w:val="20"/>
@@ -1134,21 +640,35 @@
                 <w:spacing w:val="-4"/>
                 <w:sz w:val="20"/>
               </w:rPr>
-              <w:t xml:space="preserve">NAMA </w:t>
-            </w:r>
-            <w:r>
-              <w:rPr>
-                <w:spacing w:val="-2"/>
-                <w:sz w:val="20"/>
-              </w:rPr>
-              <w:t xml:space="preserve">PENYU </w:t>
+              <w:t>NAMA</w:t>
             </w:r>
             <w:r>
               <w:rPr>
                 <w:spacing w:val="-4"/>
                 <w:sz w:val="20"/>
               </w:rPr>
-              <w:t>SUN RPS</w:t>
+              <w:t xml:space="preserve"> </w:t>
+            </w:r>
+            <w:r>
+              <w:rPr>
+                <w:spacing w:val="-2"/>
+                <w:sz w:val="20"/>
+              </w:rPr>
+              <w:t>PENYU</w:t>
+            </w:r>
+            <w:r>
+              <w:rPr>
+                <w:spacing w:val="-4"/>
+                <w:sz w:val="20"/>
+              </w:rPr>
+              <w:t>S</w:t>
+            </w:r>
+            <w:r>
+              <w:rPr>
+                <w:spacing w:val="-4"/>
+                <w:sz w:val="20"/>
+              </w:rPr>
+              <w:t>UN RPS</w:t>
             </w:r>
           </w:p>
         </w:tc>
@@ -1156,11 +676,13 @@
           <w:tcPr>
             <w:tcW w:w="2880" w:type="dxa"/>
             <w:gridSpan w:val="2"/>
-          </w:tcPr>
-          <w:p>
-            <w:pPr>
-              <w:pStyle w:val="TableParagraph"/>
-              <w:ind w:left="466"/>
+            <w:vAlign w:val="center"/>
+          </w:tcPr>
+          <w:p>
+            <w:pPr>
+              <w:pStyle w:val="TableParagraph"/>
+              <w:ind w:left="0"/>
+              <w:jc w:val="center"/>
               <w:rPr>
                 <w:sz w:val="20"/>
               </w:rPr>
@@ -1192,11 +714,12 @@
           <w:tcPr>
             <w:tcW w:w="3375" w:type="dxa"/>
             <w:gridSpan w:val="2"/>
-          </w:tcPr>
-          <w:p>
-            <w:pPr>
-              <w:pStyle w:val="TableParagraph"/>
-              <w:ind w:left="23"/>
+            <w:vAlign w:val="center"/>
+          </w:tcPr>
+          <w:p>
+            <w:pPr>
+              <w:pStyle w:val="TableParagraph"/>
+              <w:ind w:left="0"/>
               <w:jc w:val="center"/>
               <w:rPr>
                 <w:sz w:val="20"/>
@@ -1234,18 +757,19 @@
             <w:tcW w:w="2400" w:type="dxa"/>
             <w:gridSpan w:val="2"/>
             <w:shd w:val="clear" w:color="auto" w:fill="D9D9D9" w:themeFill="background1" w:themeFillShade="D9"/>
-          </w:tcPr>
-          <w:p>
-            <w:pPr>
-              <w:pStyle w:val="TableParagraph"/>
-              <w:ind w:left="124"/>
-              <w:rPr>
-                <w:sz w:val="20"/>
-              </w:rPr>
-            </w:pPr>
-            <w:r>
-              <w:rPr>
-                <w:spacing w:val="-2"/>
+            <w:vAlign w:val="center"/>
+          </w:tcPr>
+          <w:p>
+            <w:pPr>
+              <w:pStyle w:val="TableParagraph"/>
+              <w:ind w:left="0"/>
+              <w:jc w:val="center"/>
+              <w:rPr>
+                <w:sz w:val="20"/>
+              </w:rPr>
+            </w:pPr>
+            <w:r>
+              <w:rPr>
                 <w:sz w:val="20"/>
               </w:rPr>
               <w:t>{{.UPMFakultas}}</w:t>
@@ -1255,39 +779,23 @@
         <w:tc>
           <w:tcPr>
             <w:tcW w:w="975" w:type="dxa"/>
-          </w:tcPr>
-          <w:p>
-            <w:pPr>
-              <w:pStyle w:val="TableParagraph"/>
-              <w:spacing w:line="312" w:lineRule="auto"/>
-              <w:ind w:right="158"/>
-              <w:jc w:val="both"/>
-              <w:rPr>
-                <w:sz w:val="20"/>
-              </w:rPr>
-            </w:pPr>
-            <w:r>
-              <w:rPr>
-                <w:spacing w:val="-2"/>
-                <w:sz w:val="20"/>
-              </w:rPr>
-              <w:t>{{.Nam aPenyus unRPS}</w:t>
-            </w:r>
-          </w:p>
+            <w:vAlign w:val="center"/>
+          </w:tcPr>
           <w:p>
             <w:pPr>
               <w:pStyle w:val="TableParagraph"/>
               <w:spacing w:before="3"/>
-              <w:rPr>
-                <w:sz w:val="20"/>
-              </w:rPr>
-            </w:pPr>
-            <w:r>
-              <w:rPr>
-                <w:spacing w:val="-10"/>
-                <w:sz w:val="20"/>
-              </w:rPr>
-              <w:t>}</w:t>
+              <w:ind w:left="0"/>
+              <w:jc w:val="center"/>
+              <w:rPr>
+                <w:sz w:val="20"/>
+              </w:rPr>
+            </w:pPr>
+            <w:r>
+              <w:rPr>
+                <w:sz w:val="20"/>
+              </w:rPr>
+              <w:t>{{.NamaPenyusunRPS}}</w:t>
             </w:r>
           </w:p>
         </w:tc>
@@ -1295,18 +803,19 @@
           <w:tcPr>
             <w:tcW w:w="2880" w:type="dxa"/>
             <w:gridSpan w:val="2"/>
-          </w:tcPr>
-          <w:p>
-            <w:pPr>
-              <w:pStyle w:val="TableParagraph"/>
-              <w:ind w:left="121"/>
-              <w:rPr>
-                <w:sz w:val="20"/>
-              </w:rPr>
-            </w:pPr>
-            <w:r>
-              <w:rPr>
-                <w:spacing w:val="-2"/>
+            <w:vAlign w:val="center"/>
+          </w:tcPr>
+          <w:p>
+            <w:pPr>
+              <w:pStyle w:val="TableParagraph"/>
+              <w:ind w:left="0"/>
+              <w:jc w:val="center"/>
+              <w:rPr>
+                <w:sz w:val="20"/>
+              </w:rPr>
+            </w:pPr>
+            <w:r>
+              <w:rPr>
                 <w:sz w:val="20"/>
               </w:rPr>
               <w:t>{{.KoordinatorRMK}}</w:t>
@@ -1317,18 +826,19 @@
           <w:tcPr>
             <w:tcW w:w="3375" w:type="dxa"/>
             <w:gridSpan w:val="2"/>
-          </w:tcPr>
-          <w:p>
-            <w:pPr>
-              <w:pStyle w:val="TableParagraph"/>
-              <w:ind w:left="132"/>
-              <w:rPr>
-                <w:sz w:val="20"/>
-              </w:rPr>
-            </w:pPr>
-            <w:r>
-              <w:rPr>
-                <w:spacing w:val="-2"/>
+            <w:vAlign w:val="center"/>
+          </w:tcPr>
+          <w:p>
+            <w:pPr>
+              <w:pStyle w:val="TableParagraph"/>
+              <w:ind w:left="0"/>
+              <w:jc w:val="center"/>
+              <w:rPr>
+                <w:sz w:val="20"/>
+              </w:rPr>
+            </w:pPr>
+            <w:r>
+              <w:rPr>
                 <w:sz w:val="20"/>
               </w:rPr>
               <w:t>{{.KaProdi}}</w:t>
@@ -1344,82 +854,7 @@
         <w:ind w:left="570"/>
       </w:pPr>
       <w:r>
-        <w:t>{{range</w:t>
-      </w:r>
-      <w:r>
-        <w:rPr>
-          <w:spacing w:val="-1"/>
-        </w:rPr>
-        <w:t xml:space="preserve"> </w:t>
-      </w:r>
-      <w:r>
-        <w:t>.CPLList}}</w:t>
-      </w:r>
-      <w:r>
-        <w:rPr>
-          <w:spacing w:val="-1"/>
-        </w:rPr>
-        <w:t xml:space="preserve"> </w:t>
-      </w:r>
-      <w:r>
-        <w:t>{{end}}</w:t>
-      </w:r>
-      <w:r>
-        <w:rPr>
-          <w:spacing w:val="-1"/>
-        </w:rPr>
-        <w:t xml:space="preserve"> </w:t>
-      </w:r>
-      <w:r>
-        <w:t>{{range</w:t>
-      </w:r>
-      <w:r>
-        <w:rPr>
-          <w:spacing w:val="-1"/>
-        </w:rPr>
-        <w:t xml:space="preserve"> </w:t>
-      </w:r>
-      <w:r>
-        <w:t>.CPMKList}}</w:t>
-      </w:r>
-      <w:r>
-        <w:rPr>
-          <w:spacing w:val="-1"/>
-        </w:rPr>
-        <w:t xml:space="preserve"> </w:t>
-      </w:r>
-      <w:r>
-        <w:t>{{end}}</w:t>
-      </w:r>
-      <w:r>
-        <w:rPr>
-          <w:spacing w:val="-1"/>
-        </w:rPr>
-        <w:t xml:space="preserve"> </w:t>
-      </w:r>
-      <w:r>
-        <w:t>{{range</w:t>
-      </w:r>
-      <w:r>
-        <w:rPr>
-          <w:spacing w:val="-1"/>
-        </w:rPr>
-        <w:t xml:space="preserve"> </w:t>
-      </w:r>
-      <w:r>
-        <w:t>.SubCPMKList}}</w:t>
-      </w:r>
-      <w:r>
-        <w:rPr>
-          <w:spacing w:val="-1"/>
-        </w:rPr>
-        <w:t xml:space="preserve"> </w:t>
-      </w:r>
-      <w:r>
-        <w:rPr>
-          <w:spacing w:val="-2"/>
-        </w:rPr>
-        <w:t>{{end}}</w:t>
+        <w:t>{{range .CPLList}} {{end}} {{range .CPMKList}} {{end}} {{range .SubCPMKList}} {{end}}</w:t>
       </w:r>
     </w:p>
     <w:tbl>
@@ -2003,7 +1438,7 @@
       </w:tr>
       <w:tr>
         <w:trPr>
-          <w:trHeight w:val="1484"/>
+          <w:trHeight w:val="1563"/>
         </w:trPr>
         <w:tc>
           <w:tcPr>
@@ -2073,162 +1508,381 @@
           <w:p>
             <w:pPr>
               <w:pStyle w:val="TableParagraph"/>
-              <w:rPr>
-                <w:sz w:val="20"/>
-              </w:rPr>
-            </w:pPr>
-            <w:r>
-              <w:rPr>
-                <w:sz w:val="20"/>
-              </w:rPr>
-              <w:t>{{range</w:t>
-            </w:r>
-            <w:r>
-              <w:rPr>
-                <w:spacing w:val="-1"/>
-                <w:sz w:val="20"/>
-              </w:rPr>
-              <w:t xml:space="preserve"> </w:t>
-            </w:r>
-            <w:r>
-              <w:rPr>
-                <w:sz w:val="20"/>
-              </w:rPr>
-              <w:t>$index,</w:t>
-            </w:r>
-            <w:r>
-              <w:rPr>
-                <w:spacing w:val="-1"/>
-                <w:sz w:val="20"/>
-              </w:rPr>
-              <w:t xml:space="preserve"> </w:t>
-            </w:r>
-            <w:r>
-              <w:rPr>
-                <w:sz w:val="20"/>
-              </w:rPr>
-              <w:t>$header</w:t>
-            </w:r>
-            <w:r>
-              <w:rPr>
-                <w:spacing w:val="-1"/>
-                <w:sz w:val="20"/>
-              </w:rPr>
-              <w:t xml:space="preserve"> </w:t>
-            </w:r>
-            <w:r>
-              <w:rPr>
-                <w:sz w:val="20"/>
-              </w:rPr>
-              <w:t>:=</w:t>
-            </w:r>
-            <w:r>
-              <w:rPr>
-                <w:spacing w:val="-1"/>
-                <w:sz w:val="20"/>
-              </w:rPr>
-              <w:t xml:space="preserve"> </w:t>
-            </w:r>
-            <w:r>
-              <w:rPr>
-                <w:sz w:val="20"/>
-              </w:rPr>
-              <w:t>.SubCPMKHeaders}}</w:t>
-            </w:r>
-            <w:r>
-              <w:rPr>
-                <w:spacing w:val="-1"/>
-                <w:sz w:val="20"/>
-              </w:rPr>
-              <w:t xml:space="preserve"> </w:t>
-            </w:r>
-            <w:r>
-              <w:rPr>
-                <w:sz w:val="20"/>
-              </w:rPr>
-              <w:t>{{end}}</w:t>
-            </w:r>
-            <w:r>
-              <w:rPr>
-                <w:spacing w:val="-1"/>
-                <w:sz w:val="20"/>
-              </w:rPr>
-              <w:t xml:space="preserve"> </w:t>
-            </w:r>
-            <w:r>
-              <w:rPr>
-                <w:sz w:val="20"/>
-              </w:rPr>
-              <w:t>{{range</w:t>
-            </w:r>
-            <w:r>
-              <w:rPr>
-                <w:spacing w:val="-1"/>
-                <w:sz w:val="20"/>
-              </w:rPr>
-              <w:t xml:space="preserve"> </w:t>
-            </w:r>
-            <w:r>
-              <w:rPr>
-                <w:spacing w:val="-2"/>
-                <w:sz w:val="20"/>
-              </w:rPr>
-              <w:t>.CPMKKorelasi}}</w:t>
-            </w:r>
-          </w:p>
-          <w:p>
-            <w:pPr>
-              <w:pStyle w:val="TableParagraph"/>
               <w:spacing w:before="70"/>
               <w:rPr>
-                <w:sz w:val="20"/>
-              </w:rPr>
-            </w:pPr>
-            <w:r>
-              <w:rPr>
-                <w:sz w:val="20"/>
-              </w:rPr>
-              <w:t>{{range</w:t>
-            </w:r>
-            <w:r>
-              <w:rPr>
-                <w:spacing w:val="-1"/>
-                <w:sz w:val="20"/>
-              </w:rPr>
-              <w:t xml:space="preserve"> </w:t>
-            </w:r>
-            <w:r>
-              <w:rPr>
-                <w:sz w:val="20"/>
-              </w:rPr>
-              <w:t>.Korelasi}}</w:t>
-            </w:r>
-            <w:r>
-              <w:rPr>
-                <w:spacing w:val="-1"/>
-                <w:sz w:val="20"/>
-              </w:rPr>
-              <w:t xml:space="preserve"> </w:t>
-            </w:r>
-            <w:r>
-              <w:rPr>
-                <w:sz w:val="20"/>
-              </w:rPr>
-              <w:t>{{end}}</w:t>
-            </w:r>
-            <w:r>
-              <w:rPr>
-                <w:spacing w:val="-1"/>
-                <w:sz w:val="20"/>
-              </w:rPr>
-              <w:t xml:space="preserve"> </w:t>
-            </w:r>
-            <w:r>
-              <w:rPr>
-                <w:spacing w:val="-2"/>
-                <w:sz w:val="20"/>
-              </w:rPr>
-              <w:t>{{end}}</w:t>
+                <w:spacing w:val="-2"/>
+                <w:sz w:val="20"/>
+              </w:rPr>
+            </w:pPr>
+            <w:r>
+              <w:rPr>
+                <w:sz w:val="20"/>
+              </w:rPr>
+              <w:t>{{range $index, $header := .SubCPMKHeaders}} {{end}} {{range .CPMKKorelasi}} {{range .Korelasi}} {{end}} {{end}}</w:t>
+            </w:r>
+          </w:p>
+          <w:p>
+            <w:pPr>
+              <w:pStyle w:val="TableParagraph"/>
+              <w:spacing w:before="70"/>
+              <w:rPr>
+                <w:sz w:val="20"/>
+              </w:rPr>
+            </w:pPr>
+            <w:r>
+              <w:rPr>
+                <w:noProof/>
+              </w:rPr>
+              <mc:AlternateContent>
+                <mc:Choice Requires="wps">
+                  <w:drawing>
+                    <wp:inline distT="0" distB="0" distL="0" distR="0" wp14:anchorId="5A175917" wp14:editId="4CC1B9EC">
+                      <wp:extent cx="4505325" cy="484505"/>
+                      <wp:effectExtent l="0" t="0" r="0" b="0"/>
+                      <wp:docPr id="5" name="Textbox 5"/>
+                      <wp:cNvGraphicFramePr>
+                        <a:graphicFrameLocks xmlns:a="http://schemas.openxmlformats.org/drawingml/2006/main"/>
+                      </wp:cNvGraphicFramePr>
+                      <a:graphic xmlns:a="http://schemas.openxmlformats.org/drawingml/2006/main">
+                        <a:graphicData uri="http://schemas.microsoft.com/office/word/2010/wordprocessingShape">
+                          <wps:wsp>
+                            <wps:cNvSpPr txBox="1">
+                              <a:spLocks/>
+                            </wps:cNvSpPr>
+                            <wps:spPr>
+                              <a:xfrm>
+                                <a:off x="0" y="0"/>
+                                <a:ext cx="4505325" cy="484505"/>
+                              </a:xfrm>
+                              <a:prstGeom prst="rect">
+                                <a:avLst/>
+                              </a:prstGeom>
+                            </wps:spPr>
+                            <wps:txbx>
+                              <w:txbxContent>
+                                <w:tbl>
+                                  <w:tblPr>
+                                    <w:tblW w:w="0" w:type="auto"/>
+                                    <w:tblInd w:w="67" w:type="dxa"/>
+                                    <w:tblBorders>
+                                      <w:top w:val="single" w:sz="6" w:space="0" w:color="000000"/>
+                                      <w:left w:val="single" w:sz="6" w:space="0" w:color="000000"/>
+                                      <w:bottom w:val="single" w:sz="6" w:space="0" w:color="000000"/>
+                                      <w:right w:val="single" w:sz="6" w:space="0" w:color="000000"/>
+                                      <w:insideH w:val="single" w:sz="6" w:space="0" w:color="000000"/>
+                                      <w:insideV w:val="single" w:sz="6" w:space="0" w:color="000000"/>
+                                    </w:tblBorders>
+                                    <w:tblLayout w:type="fixed"/>
+                                    <w:tblCellMar>
+                                      <w:left w:w="0" w:type="dxa"/>
+                                      <w:right w:w="0" w:type="dxa"/>
+                                    </w:tblCellMar>
+                                    <w:tblLook w:val="01E0" w:firstRow="1" w:lastRow="1" w:firstColumn="1" w:lastColumn="1" w:noHBand="0" w:noVBand="0"/>
+                                  </w:tblPr>
+                                  <w:tblGrid>
+                                    <w:gridCol w:w="4350"/>
+                                    <w:gridCol w:w="2610"/>
+                                  </w:tblGrid>
+                                  <w:tr>
+                                    <w:trPr>
+                                      <w:trHeight w:val="359"/>
+                                    </w:trPr>
+                                    <w:tc>
+                                      <w:tcPr>
+                                        <w:tcW w:w="4350" w:type="dxa"/>
+                                        <w:vAlign w:val="center"/>
+                                      </w:tcPr>
+                                      <w:p>
+                                        <w:pPr>
+                                          <w:pStyle w:val="TableParagraph"/>
+                                          <w:spacing w:before="53"/>
+                                          <w:ind w:left="24"/>
+                                          <w:jc w:val="center"/>
+                                          <w:rPr>
+                                            <w:sz w:val="20"/>
+                                          </w:rPr>
+                                        </w:pPr>
+                                        <w:r>
+                                          <w:rPr>
+                                            <w:spacing w:val="-4"/>
+                                            <w:sz w:val="20"/>
+                                          </w:rPr>
+                                          <w:t>CPMK</w:t>
+                                        </w:r>
+                                      </w:p>
+                                    </w:tc>
+                                    <w:tc>
+                                      <w:tcPr>
+                                        <w:tcW w:w="2610" w:type="dxa"/>
+                                        <w:vAlign w:val="center"/>
+                                      </w:tcPr>
+                                      <w:p>
+                                        <w:pPr>
+                                          <w:pStyle w:val="TableParagraph"/>
+                                          <w:spacing w:before="53"/>
+                                          <w:ind w:left="22"/>
+                                          <w:jc w:val="center"/>
+                                          <w:rPr>
+                                            <w:sz w:val="20"/>
+                                          </w:rPr>
+                                        </w:pPr>
+                                        <w:r>
+                                          <w:rPr>
+                                            <w:sz w:val="20"/>
+                                          </w:rPr>
+                                          <w:t>S-{{add $index 1}}</w:t>
+                                        </w:r>
+                                      </w:p>
+                                    </w:tc>
+                                  </w:tr>
+                                  <w:tr>
+                                    <w:trPr>
+                                      <w:trHeight w:val="359"/>
+                                    </w:trPr>
+                                    <w:tc>
+                                      <w:tcPr>
+                                        <w:tcW w:w="4350" w:type="dxa"/>
+                                        <w:vAlign w:val="center"/>
+                                      </w:tcPr>
+                                      <w:p>
+                                        <w:pPr>
+                                          <w:pStyle w:val="TableParagraph"/>
+                                          <w:spacing w:before="53"/>
+                                          <w:ind w:left="24"/>
+                                          <w:jc w:val="center"/>
+                                          <w:rPr>
+                                            <w:b/>
+                                            <w:sz w:val="20"/>
+                                          </w:rPr>
+                                        </w:pPr>
+                                        <w:r>
+                                          <w:rPr>
+                                            <w:b/>
+                                            <w:bCs/>
+                                            <w:sz w:val="20"/>
+                                          </w:rPr>
+                                          <w:t>{{.CPMKKode}}</w:t>
+                                        </w:r>
+                                      </w:p>
+                                    </w:tc>
+                                    <w:tc>
+                                      <w:tcPr>
+                                        <w:tcW w:w="2610" w:type="dxa"/>
+                                        <w:vAlign w:val="center"/>
+                                      </w:tcPr>
+                                      <w:p>
+                                        <w:pPr>
+                                          <w:pStyle w:val="TableParagraph"/>
+                                          <w:spacing w:before="24"/>
+                                          <w:ind w:left="22"/>
+                                          <w:jc w:val="center"/>
+                                          <w:rPr>
+                                            <w:sz w:val="20"/>
+                                          </w:rPr>
+                                        </w:pPr>
+                                        <w:r>
+                                          <w:rPr>
+                                            <w:sz w:val="20"/>
+                                          </w:rPr>
+                                          <w:t>{{if .}}</w:t>
+                                        </w:r>
+                                        <w:r>
+                                          <w:rPr>
+                                            <w:rFonts w:ascii="Segoe UI Symbol" w:hAnsi="Segoe UI Symbol" w:cs="Segoe UI Symbol"/>
+                                            <w:sz w:val="20"/>
+                                          </w:rPr>
+                                          <w:t>✓</w:t>
+                                        </w:r>
+                                        <w:r>
+                                          <w:rPr>
+                                            <w:sz w:val="20"/>
+                                          </w:rPr>
+                                          <w:t>{{end}}</w:t>
+                                        </w:r>
+                                      </w:p>
+                                    </w:tc>
+                                  </w:tr>
+                                </w:tbl>
+                                <w:p>
+                                  <w:pPr>
+                                    <w:pStyle w:val="BodyText"/>
+                                  </w:pPr>
+                                </w:p>
+                              </w:txbxContent>
+                            </wps:txbx>
+                            <wps:bodyPr wrap="square" lIns="0" tIns="0" rIns="0" bIns="0" rtlCol="0">
+                              <a:noAutofit/>
+                            </wps:bodyPr>
+                          </wps:wsp>
+                        </a:graphicData>
+                      </a:graphic>
+                    </wp:inline>
+                  </w:drawing>
+                </mc:Choice>
+                <mc:Fallback>
+                  <w:pict>
+                    <v:shapetype w14:anchorId="5A175917" id="_x0000_t202" coordsize="21600,21600" o:spt="202" path="m,l,21600r21600,l21600,xe">
+                      <v:stroke joinstyle="miter"/>
+                      <v:path gradientshapeok="t" o:connecttype="rect"/>
+                    </v:shapetype>
+                    <v:shape id="Textbox 5" o:spid="_x0000_s1026" type="#_x0000_t202" style="width:354.75pt;height:38.15pt;visibility:visible;mso-wrap-style:square;mso-left-percent:-10001;mso-top-percent:-10001;mso-position-horizontal:absolute;mso-position-horizontal-relative:char;mso-position-vertical:absolute;mso-position-vertical-relative:line;mso-left-percent:-10001;mso-top-percent:-10001;v-text-anchor:top" o:gfxdata="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" filled="f" stroked="f">
+                      <v:textbox inset="0,0,0,0">
+                        <w:txbxContent>
+                          <w:tbl>
+                            <w:tblPr>
+                              <w:tblW w:w="0" w:type="auto"/>
+                              <w:tblInd w:w="67" w:type="dxa"/>
+                              <w:tblBorders>
+                                <w:top w:val="single" w:sz="6" w:space="0" w:color="000000"/>
+                                <w:left w:val="single" w:sz="6" w:space="0" w:color="000000"/>
+                                <w:bottom w:val="single" w:sz="6" w:space="0" w:color="000000"/>
+                                <w:right w:val="single" w:sz="6" w:space="0" w:color="000000"/>
+                                <w:insideH w:val="single" w:sz="6" w:space="0" w:color="000000"/>
+                                <w:insideV w:val="single" w:sz="6" w:space="0" w:color="000000"/>
+                              </w:tblBorders>
+                              <w:tblLayout w:type="fixed"/>
+                              <w:tblCellMar>
+                                <w:left w:w="0" w:type="dxa"/>
+                                <w:right w:w="0" w:type="dxa"/>
+                              </w:tblCellMar>
+                              <w:tblLook w:val="01E0" w:firstRow="1" w:lastRow="1" w:firstColumn="1" w:lastColumn="1" w:noHBand="0" w:noVBand="0"/>
+                            </w:tblPr>
+                            <w:tblGrid>
+                              <w:gridCol w:w="4350"/>
+                              <w:gridCol w:w="2610"/>
+                            </w:tblGrid>
+                            <w:tr>
+                              <w:trPr>
+                                <w:trHeight w:val="359"/>
+                              </w:trPr>
+                              <w:tc>
+                                <w:tcPr>
+                                  <w:tcW w:w="4350" w:type="dxa"/>
+                                  <w:vAlign w:val="center"/>
+                                </w:tcPr>
+                                <w:p>
+                                  <w:pPr>
+                                    <w:pStyle w:val="TableParagraph"/>
+                                    <w:spacing w:before="53"/>
+                                    <w:ind w:left="24"/>
+                                    <w:jc w:val="center"/>
+                                    <w:rPr>
+                                      <w:sz w:val="20"/>
+                                    </w:rPr>
+                                  </w:pPr>
+                                  <w:r>
+                                    <w:rPr>
+                                      <w:spacing w:val="-4"/>
+                                      <w:sz w:val="20"/>
+                                    </w:rPr>
+                                    <w:t>CPMK</w:t>
+                                  </w:r>
+                                </w:p>
+                              </w:tc>
+                              <w:tc>
+                                <w:tcPr>
+                                  <w:tcW w:w="2610" w:type="dxa"/>
+                                  <w:vAlign w:val="center"/>
+                                </w:tcPr>
+                                <w:p>
+                                  <w:pPr>
+                                    <w:pStyle w:val="TableParagraph"/>
+                                    <w:spacing w:before="53"/>
+                                    <w:ind w:left="22"/>
+                                    <w:jc w:val="center"/>
+                                    <w:rPr>
+                                      <w:sz w:val="20"/>
+                                    </w:rPr>
+                                  </w:pPr>
+                                  <w:r>
+                                    <w:rPr>
+                                      <w:sz w:val="20"/>
+                                    </w:rPr>
+                                    <w:t>S-{{add $index 1}}</w:t>
+                                  </w:r>
+                                </w:p>
+                              </w:tc>
+                            </w:tr>
+                            <w:tr>
+                              <w:trPr>
+                                <w:trHeight w:val="359"/>
+                              </w:trPr>
+                              <w:tc>
+                                <w:tcPr>
+                                  <w:tcW w:w="4350" w:type="dxa"/>
+                                  <w:vAlign w:val="center"/>
+                                </w:tcPr>
+                                <w:p>
+                                  <w:pPr>
+                                    <w:pStyle w:val="TableParagraph"/>
+                                    <w:spacing w:before="53"/>
+                                    <w:ind w:left="24"/>
+                                    <w:jc w:val="center"/>
+                                    <w:rPr>
+                                      <w:b/>
+                                      <w:sz w:val="20"/>
+                                    </w:rPr>
+                                  </w:pPr>
+                                  <w:r>
+                                    <w:rPr>
+                                      <w:b/>
+                                      <w:bCs/>
+                                      <w:sz w:val="20"/>
+                                    </w:rPr>
+                                    <w:t>{{.CPMKKode}}</w:t>
+                                  </w:r>
+                                </w:p>
+                              </w:tc>
+                              <w:tc>
+                                <w:tcPr>
+                                  <w:tcW w:w="2610" w:type="dxa"/>
+                                  <w:vAlign w:val="center"/>
+                                </w:tcPr>
+                                <w:p>
+                                  <w:pPr>
+                                    <w:pStyle w:val="TableParagraph"/>
+                                    <w:spacing w:before="24"/>
+                                    <w:ind w:left="22"/>
+                                    <w:jc w:val="center"/>
+                                    <w:rPr>
+                                      <w:sz w:val="20"/>
+                                    </w:rPr>
+                                  </w:pPr>
+                                  <w:r>
+                                    <w:rPr>
+                                      <w:sz w:val="20"/>
+                                    </w:rPr>
+                                    <w:t>{{if .}}</w:t>
+                                  </w:r>
+                                  <w:r>
+                                    <w:rPr>
+                                      <w:rFonts w:ascii="Segoe UI Symbol" w:hAnsi="Segoe UI Symbol" w:cs="Segoe UI Symbol"/>
+                                      <w:sz w:val="20"/>
+                                    </w:rPr>
+                                    <w:t>✓</w:t>
+                                  </w:r>
+                                  <w:r>
+                                    <w:rPr>
+                                      <w:sz w:val="20"/>
+                                    </w:rPr>
+                                    <w:t>{{end}}</w:t>
+                                  </w:r>
+                                </w:p>
+                              </w:tc>
+                            </w:tr>
+                          </w:tbl>
+                          <w:p>
+                            <w:pPr>
+                              <w:pStyle w:val="BodyText"/>
+                            </w:pPr>
+                          </w:p>
+                        </w:txbxContent>
+                      </v:textbox>
+                      <w10:anchorlock/>
+                    </v:shape>
+                  </w:pict>
+                </mc:Fallback>
+              </mc:AlternateContent>
             </w:r>
           </w:p>
         </w:tc>
@@ -2630,73 +2284,7 @@
         <w:ind w:left="570"/>
       </w:pPr>
       <w:r>
-        <w:t>{{range</w:t>
-      </w:r>
-      <w:r>
-        <w:rPr>
-          <w:spacing w:val="-1"/>
-        </w:rPr>
-        <w:t xml:space="preserve"> </w:t>
-      </w:r>
-      <w:r>
-        <w:t>.RencanaMingguan}}</w:t>
-      </w:r>
-      <w:r>
-        <w:rPr>
-          <w:spacing w:val="-1"/>
-        </w:rPr>
-        <w:t xml:space="preserve"> </w:t>
-      </w:r>
-      <w:r>
-        <w:t>{{if</w:t>
-      </w:r>
-      <w:r>
-        <w:rPr>
-          <w:spacing w:val="-1"/>
-        </w:rPr>
-        <w:t xml:space="preserve"> </w:t>
-      </w:r>
-      <w:r>
-        <w:t>le</w:t>
-      </w:r>
-      <w:r>
-        <w:rPr>
-          <w:spacing w:val="-1"/>
-        </w:rPr>
-        <w:t xml:space="preserve"> </w:t>
-      </w:r>
-      <w:r>
-        <w:t>.Minggu</w:t>
-      </w:r>
-      <w:r>
-        <w:rPr>
-          <w:spacing w:val="-1"/>
-        </w:rPr>
-        <w:t xml:space="preserve"> </w:t>
-      </w:r>
-      <w:r>
-        <w:t>7}}</w:t>
-      </w:r>
-      <w:r>
-        <w:rPr>
-          <w:spacing w:val="-1"/>
-        </w:rPr>
-        <w:t xml:space="preserve"> </w:t>
-      </w:r>
-      <w:r>
-        <w:t>{{end}}</w:t>
-      </w:r>
-      <w:r>
-        <w:rPr>
-          <w:spacing w:val="-1"/>
-        </w:rPr>
-        <w:t xml:space="preserve"> </w:t>
-      </w:r>
-      <w:r>
-        <w:rPr>
-          <w:spacing w:val="-2"/>
-        </w:rPr>
-        <w:t>{{end}}</w:t>
+        <w:t>{{range .RencanaMingguan}} {{if le .Minggu 7}} {{end}} {{end}}</w:t>
       </w:r>
     </w:p>
     <w:tbl>
@@ -2959,259 +2547,186 @@
         <w:tc>
           <w:tcPr>
             <w:tcW w:w="480" w:type="dxa"/>
+            <w:vAlign w:val="center"/>
+          </w:tcPr>
+          <w:p>
+            <w:pPr>
+              <w:pStyle w:val="TableParagraph"/>
+              <w:spacing w:before="3"/>
+              <w:ind w:left="0" w:right="62"/>
+              <w:jc w:val="center"/>
+              <w:rPr>
+                <w:b/>
+                <w:sz w:val="20"/>
+              </w:rPr>
+            </w:pPr>
+            <w:r>
+              <w:rPr>
+                <w:b/>
+                <w:sz w:val="20"/>
+              </w:rPr>
+              <w:t>{{.Minggu}}</w:t>
+            </w:r>
+          </w:p>
+        </w:tc>
+        <w:tc>
+          <w:tcPr>
+            <w:tcW w:w="1740" w:type="dxa"/>
+            <w:vAlign w:val="center"/>
+          </w:tcPr>
+          <w:p>
+            <w:pPr>
+              <w:pStyle w:val="TableParagraph"/>
+              <w:spacing w:before="75"/>
+              <w:ind w:left="0"/>
+              <w:jc w:val="center"/>
+              <w:rPr>
+                <w:sz w:val="16"/>
+              </w:rPr>
+            </w:pPr>
+            <w:r>
+              <w:rPr>
+                <w:sz w:val="16"/>
+              </w:rPr>
+              <w:t>{{.SubCPMK}}</w:t>
+            </w:r>
+          </w:p>
+        </w:tc>
+        <w:tc>
+          <w:tcPr>
+            <w:tcW w:w="1335" w:type="dxa"/>
+            <w:vAlign w:val="center"/>
+          </w:tcPr>
+          <w:p>
+            <w:pPr>
+              <w:pStyle w:val="TableParagraph"/>
+              <w:spacing w:before="75"/>
+              <w:ind w:left="0"/>
+              <w:jc w:val="center"/>
+              <w:rPr>
+                <w:sz w:val="16"/>
+              </w:rPr>
+            </w:pPr>
+            <w:r>
+              <w:rPr>
+                <w:sz w:val="16"/>
+              </w:rPr>
+              <w:t>{{.Indikator}}</w:t>
+            </w:r>
+          </w:p>
+        </w:tc>
+        <w:tc>
+          <w:tcPr>
+            <w:tcW w:w="1545" w:type="dxa"/>
+            <w:vAlign w:val="center"/>
+          </w:tcPr>
+          <w:p>
+            <w:pPr>
+              <w:pStyle w:val="TableParagraph"/>
+              <w:spacing w:before="75"/>
+              <w:ind w:left="0"/>
+              <w:jc w:val="center"/>
+              <w:rPr>
+                <w:sz w:val="16"/>
+              </w:rPr>
+            </w:pPr>
+            <w:r>
+              <w:rPr>
+                <w:sz w:val="16"/>
+              </w:rPr>
+              <w:t>{{.Materi}}</w:t>
+            </w:r>
+          </w:p>
+        </w:tc>
+        <w:tc>
+          <w:tcPr>
+            <w:tcW w:w="1455" w:type="dxa"/>
+            <w:vAlign w:val="center"/>
+          </w:tcPr>
+          <w:p>
+            <w:pPr>
+              <w:pStyle w:val="TableParagraph"/>
+              <w:spacing w:before="75"/>
+              <w:ind w:left="0"/>
+              <w:jc w:val="center"/>
+              <w:rPr>
+                <w:sz w:val="16"/>
+              </w:rPr>
+            </w:pPr>
+            <w:r>
+              <w:rPr>
+                <w:sz w:val="16"/>
+              </w:rPr>
+              <w:t>{{.Metode}}</w:t>
+            </w:r>
+          </w:p>
+        </w:tc>
+        <w:tc>
+          <w:tcPr>
+            <w:tcW w:w="675" w:type="dxa"/>
+            <w:vAlign w:val="center"/>
+          </w:tcPr>
+          <w:p>
+            <w:pPr>
+              <w:pStyle w:val="TableParagraph"/>
+              <w:spacing w:before="56"/>
+              <w:ind w:left="0"/>
+              <w:jc w:val="center"/>
+              <w:rPr>
+                <w:sz w:val="16"/>
+              </w:rPr>
+            </w:pPr>
+            <w:r>
+              <w:rPr>
+                <w:sz w:val="16"/>
+              </w:rPr>
+              <w:t>{{.Waktu}}</w:t>
+            </w:r>
+          </w:p>
+        </w:tc>
+        <w:tc>
+          <w:tcPr>
+            <w:tcW w:w="1530" w:type="dxa"/>
+            <w:vAlign w:val="center"/>
+          </w:tcPr>
+          <w:p>
+            <w:pPr>
+              <w:pStyle w:val="TableParagraph"/>
+              <w:spacing w:before="75"/>
+              <w:ind w:left="0"/>
+              <w:jc w:val="center"/>
+              <w:rPr>
+                <w:sz w:val="16"/>
+              </w:rPr>
+            </w:pPr>
+            <w:r>
+              <w:rPr>
+                <w:sz w:val="16"/>
+              </w:rPr>
+              <w:t>{{.Penilaian}}</w:t>
+            </w:r>
+          </w:p>
+        </w:tc>
+        <w:tc>
+          <w:tcPr>
+            <w:tcW w:w="870" w:type="dxa"/>
+            <w:vAlign w:val="center"/>
           </w:tcPr>
           <w:p>
             <w:pPr>
               <w:pStyle w:val="TableParagraph"/>
               <w:spacing w:line="312" w:lineRule="auto"/>
-              <w:ind w:left="71" w:right="59"/>
-              <w:jc w:val="center"/>
-              <w:rPr>
-                <w:b/>
-                <w:sz w:val="20"/>
-              </w:rPr>
-            </w:pPr>
-            <w:r>
-              <w:rPr>
-                <w:b/>
-                <w:spacing w:val="-4"/>
-                <w:sz w:val="20"/>
-              </w:rPr>
-              <w:t xml:space="preserve">{{. </w:t>
-            </w:r>
-            <w:r>
-              <w:rPr>
-                <w:b/>
-                <w:spacing w:val="-10"/>
-                <w:sz w:val="20"/>
-              </w:rPr>
-              <w:t>M</w:t>
-            </w:r>
-          </w:p>
-          <w:p>
-            <w:pPr>
-              <w:pStyle w:val="TableParagraph"/>
-              <w:spacing w:before="2" w:line="312" w:lineRule="auto"/>
-              <w:ind w:left="137" w:right="125" w:firstLine="16"/>
-              <w:jc w:val="both"/>
-              <w:rPr>
-                <w:b/>
-                <w:sz w:val="20"/>
-              </w:rPr>
-            </w:pPr>
-            <w:r>
-              <w:rPr>
-                <w:b/>
-                <w:spacing w:val="-6"/>
-                <w:sz w:val="20"/>
-              </w:rPr>
-              <w:t xml:space="preserve">in gg </w:t>
-            </w:r>
-            <w:r>
-              <w:rPr>
-                <w:b/>
-                <w:spacing w:val="-5"/>
-                <w:sz w:val="20"/>
-              </w:rPr>
-              <w:t>u}</w:t>
-            </w:r>
-          </w:p>
-          <w:p>
-            <w:pPr>
-              <w:pStyle w:val="TableParagraph"/>
-              <w:spacing w:before="3"/>
-              <w:ind w:left="71" w:right="62"/>
-              <w:jc w:val="center"/>
-              <w:rPr>
-                <w:b/>
-                <w:sz w:val="20"/>
-              </w:rPr>
-            </w:pPr>
-            <w:r>
-              <w:rPr>
-                <w:b/>
-                <w:spacing w:val="-10"/>
-                <w:sz w:val="20"/>
-              </w:rPr>
-              <w:t>}</w:t>
-            </w:r>
-          </w:p>
-        </w:tc>
-        <w:tc>
-          <w:tcPr>
-            <w:tcW w:w="1740" w:type="dxa"/>
-          </w:tcPr>
-          <w:p>
-            <w:pPr>
-              <w:pStyle w:val="TableParagraph"/>
-              <w:spacing w:before="75"/>
-              <w:ind w:left="125"/>
-              <w:rPr>
-                <w:sz w:val="16"/>
-              </w:rPr>
-            </w:pPr>
-            <w:r>
-              <w:rPr>
-                <w:spacing w:val="-2"/>
-                <w:sz w:val="16"/>
-              </w:rPr>
-              <w:t>{{.SubCPMK}}</w:t>
-            </w:r>
-          </w:p>
-        </w:tc>
-        <w:tc>
-          <w:tcPr>
-            <w:tcW w:w="1335" w:type="dxa"/>
-          </w:tcPr>
-          <w:p>
-            <w:pPr>
-              <w:pStyle w:val="TableParagraph"/>
-              <w:spacing w:before="75"/>
-              <w:ind w:left="120"/>
-              <w:rPr>
-                <w:sz w:val="16"/>
-              </w:rPr>
-            </w:pPr>
-            <w:r>
-              <w:rPr>
-                <w:spacing w:val="-2"/>
-                <w:sz w:val="16"/>
-              </w:rPr>
-              <w:t>{{.Indikator}}</w:t>
-            </w:r>
-          </w:p>
-        </w:tc>
-        <w:tc>
-          <w:tcPr>
-            <w:tcW w:w="1545" w:type="dxa"/>
-          </w:tcPr>
-          <w:p>
-            <w:pPr>
-              <w:pStyle w:val="TableParagraph"/>
-              <w:spacing w:before="75"/>
-              <w:ind w:left="134"/>
-              <w:rPr>
-                <w:sz w:val="16"/>
-              </w:rPr>
-            </w:pPr>
-            <w:r>
-              <w:rPr>
-                <w:spacing w:val="-2"/>
-                <w:sz w:val="16"/>
-              </w:rPr>
-              <w:t>{{.Materi}}</w:t>
-            </w:r>
-          </w:p>
-        </w:tc>
-        <w:tc>
-          <w:tcPr>
-            <w:tcW w:w="1455" w:type="dxa"/>
-          </w:tcPr>
-          <w:p>
-            <w:pPr>
-              <w:pStyle w:val="TableParagraph"/>
-              <w:spacing w:before="75"/>
-              <w:ind w:left="131"/>
-              <w:rPr>
-                <w:sz w:val="16"/>
-              </w:rPr>
-            </w:pPr>
-            <w:r>
-              <w:rPr>
-                <w:spacing w:val="-2"/>
-                <w:sz w:val="16"/>
-              </w:rPr>
-              <w:t>{{.Metode}}</w:t>
-            </w:r>
-          </w:p>
-        </w:tc>
-        <w:tc>
-          <w:tcPr>
-            <w:tcW w:w="675" w:type="dxa"/>
-          </w:tcPr>
-          <w:p>
-            <w:pPr>
-              <w:pStyle w:val="TableParagraph"/>
-              <w:spacing w:before="75"/>
-              <w:ind w:left="129"/>
-              <w:rPr>
-                <w:sz w:val="16"/>
-              </w:rPr>
-            </w:pPr>
-            <w:r>
-              <w:rPr>
-                <w:spacing w:val="-2"/>
-                <w:sz w:val="16"/>
-              </w:rPr>
-              <w:t>{{.Wa</w:t>
-            </w:r>
-          </w:p>
-          <w:p>
-            <w:pPr>
-              <w:pStyle w:val="TableParagraph"/>
-              <w:spacing w:before="56"/>
-              <w:ind w:left="152"/>
-              <w:rPr>
-                <w:sz w:val="16"/>
-              </w:rPr>
-            </w:pPr>
-            <w:r>
-              <w:rPr>
-                <w:spacing w:val="-2"/>
-                <w:sz w:val="16"/>
-              </w:rPr>
-              <w:t>ktu}}</w:t>
-            </w:r>
-          </w:p>
-        </w:tc>
-        <w:tc>
-          <w:tcPr>
-            <w:tcW w:w="1530" w:type="dxa"/>
-          </w:tcPr>
-          <w:p>
-            <w:pPr>
-              <w:pStyle w:val="TableParagraph"/>
-              <w:spacing w:before="75"/>
-              <w:ind w:left="120"/>
-              <w:rPr>
-                <w:sz w:val="16"/>
-              </w:rPr>
-            </w:pPr>
-            <w:r>
-              <w:rPr>
-                <w:spacing w:val="-2"/>
-                <w:sz w:val="16"/>
-              </w:rPr>
-              <w:t>{{.Penilaian}}</w:t>
-            </w:r>
-          </w:p>
-        </w:tc>
-        <w:tc>
-          <w:tcPr>
-            <w:tcW w:w="870" w:type="dxa"/>
-          </w:tcPr>
-          <w:p>
-            <w:pPr>
-              <w:pStyle w:val="TableParagraph"/>
-              <w:spacing w:line="312" w:lineRule="auto"/>
-              <w:ind w:left="265" w:right="120" w:hanging="114"/>
-              <w:rPr>
-                <w:sz w:val="20"/>
-              </w:rPr>
-            </w:pPr>
-            <w:r>
-              <w:rPr>
-                <w:spacing w:val="-2"/>
-                <w:sz w:val="20"/>
-              </w:rPr>
-              <w:t xml:space="preserve">{{.Bob </w:t>
-            </w:r>
-            <w:r>
-              <w:rPr>
-                <w:spacing w:val="-4"/>
-                <w:sz w:val="20"/>
-              </w:rPr>
-              <w:t>ot}}</w:t>
+              <w:ind w:left="0" w:right="120"/>
+              <w:jc w:val="center"/>
+              <w:rPr>
+                <w:sz w:val="20"/>
+              </w:rPr>
+            </w:pPr>
+            <w:r>
+              <w:rPr>
+                <w:sz w:val="20"/>
+              </w:rPr>
+              <w:t>{{.Bobot}}</w:t>
             </w:r>
           </w:p>
         </w:tc>
@@ -3258,109 +2773,7 @@
         <w:ind w:left="570"/>
       </w:pPr>
       <w:r>
-        <w:t>{{range</w:t>
-      </w:r>
-      <w:r>
-        <w:rPr>
-          <w:spacing w:val="-1"/>
-        </w:rPr>
-        <w:t xml:space="preserve"> </w:t>
-      </w:r>
-      <w:r>
-        <w:t>.RencanaMingguan}}</w:t>
-      </w:r>
-      <w:r>
-        <w:rPr>
-          <w:spacing w:val="-1"/>
-        </w:rPr>
-        <w:t xml:space="preserve"> </w:t>
-      </w:r>
-      <w:r>
-        <w:t>{{if</w:t>
-      </w:r>
-      <w:r>
-        <w:rPr>
-          <w:spacing w:val="-1"/>
-        </w:rPr>
-        <w:t xml:space="preserve"> </w:t>
-      </w:r>
-      <w:r>
-        <w:t>and</w:t>
-      </w:r>
-      <w:r>
-        <w:rPr>
-          <w:spacing w:val="-1"/>
-        </w:rPr>
-        <w:t xml:space="preserve"> </w:t>
-      </w:r>
-      <w:r>
-        <w:t>(ge</w:t>
-      </w:r>
-      <w:r>
-        <w:rPr>
-          <w:spacing w:val="-1"/>
-        </w:rPr>
-        <w:t xml:space="preserve"> </w:t>
-      </w:r>
-      <w:r>
-        <w:t>.Minggu</w:t>
-      </w:r>
-      <w:r>
-        <w:rPr>
-          <w:spacing w:val="-1"/>
-        </w:rPr>
-        <w:t xml:space="preserve"> </w:t>
-      </w:r>
-      <w:r>
-        <w:t>8)</w:t>
-      </w:r>
-      <w:r>
-        <w:rPr>
-          <w:spacing w:val="-1"/>
-        </w:rPr>
-        <w:t xml:space="preserve"> </w:t>
-      </w:r>
-      <w:r>
-        <w:t>(le</w:t>
-      </w:r>
-      <w:r>
-        <w:rPr>
-          <w:spacing w:val="-1"/>
-        </w:rPr>
-        <w:t xml:space="preserve"> </w:t>
-      </w:r>
-      <w:r>
-        <w:t>.Minggu</w:t>
-      </w:r>
-      <w:r>
-        <w:rPr>
-          <w:spacing w:val="-1"/>
-        </w:rPr>
-        <w:t xml:space="preserve"> </w:t>
-      </w:r>
-      <w:r>
-        <w:t>16)}}</w:t>
-      </w:r>
-      <w:r>
-        <w:rPr>
-          <w:spacing w:val="-1"/>
-        </w:rPr>
-        <w:t xml:space="preserve"> </w:t>
-      </w:r>
-      <w:r>
-        <w:t>{{end}}</w:t>
-      </w:r>
-      <w:r>
-        <w:rPr>
-          <w:spacing w:val="-1"/>
-        </w:rPr>
-        <w:t xml:space="preserve"> </w:t>
-      </w:r>
-      <w:r>
-        <w:rPr>
-          <w:spacing w:val="-2"/>
-        </w:rPr>
-        <w:t>{{end}}</w:t>
+        <w:t>{{range .RencanaMingguan}} {{if and (ge .Minggu 8) (le .Minggu 16)}} {{end}} {{end}}</w:t>
       </w:r>
     </w:p>
     <w:tbl>
@@ -3623,259 +3036,186 @@
         <w:tc>
           <w:tcPr>
             <w:tcW w:w="480" w:type="dxa"/>
+            <w:vAlign w:val="center"/>
+          </w:tcPr>
+          <w:p>
+            <w:pPr>
+              <w:pStyle w:val="TableParagraph"/>
+              <w:spacing w:before="3"/>
+              <w:ind w:left="0" w:right="62"/>
+              <w:jc w:val="center"/>
+              <w:rPr>
+                <w:b/>
+                <w:sz w:val="20"/>
+              </w:rPr>
+            </w:pPr>
+            <w:r>
+              <w:rPr>
+                <w:b/>
+                <w:sz w:val="20"/>
+              </w:rPr>
+              <w:t>{{.Minggu}}</w:t>
+            </w:r>
+          </w:p>
+        </w:tc>
+        <w:tc>
+          <w:tcPr>
+            <w:tcW w:w="1740" w:type="dxa"/>
+            <w:vAlign w:val="center"/>
+          </w:tcPr>
+          <w:p>
+            <w:pPr>
+              <w:pStyle w:val="TableParagraph"/>
+              <w:spacing w:before="75"/>
+              <w:ind w:left="0"/>
+              <w:jc w:val="center"/>
+              <w:rPr>
+                <w:sz w:val="16"/>
+              </w:rPr>
+            </w:pPr>
+            <w:r>
+              <w:rPr>
+                <w:sz w:val="16"/>
+              </w:rPr>
+              <w:t>{{.SubCPMK}}</w:t>
+            </w:r>
+          </w:p>
+        </w:tc>
+        <w:tc>
+          <w:tcPr>
+            <w:tcW w:w="1335" w:type="dxa"/>
+            <w:vAlign w:val="center"/>
+          </w:tcPr>
+          <w:p>
+            <w:pPr>
+              <w:pStyle w:val="TableParagraph"/>
+              <w:spacing w:before="75"/>
+              <w:ind w:left="0"/>
+              <w:jc w:val="center"/>
+              <w:rPr>
+                <w:sz w:val="16"/>
+              </w:rPr>
+            </w:pPr>
+            <w:r>
+              <w:rPr>
+                <w:sz w:val="16"/>
+              </w:rPr>
+              <w:t>{{.Indikator}}</w:t>
+            </w:r>
+          </w:p>
+        </w:tc>
+        <w:tc>
+          <w:tcPr>
+            <w:tcW w:w="1545" w:type="dxa"/>
+            <w:vAlign w:val="center"/>
+          </w:tcPr>
+          <w:p>
+            <w:pPr>
+              <w:pStyle w:val="TableParagraph"/>
+              <w:spacing w:before="75"/>
+              <w:ind w:left="0"/>
+              <w:jc w:val="center"/>
+              <w:rPr>
+                <w:sz w:val="16"/>
+              </w:rPr>
+            </w:pPr>
+            <w:r>
+              <w:rPr>
+                <w:sz w:val="16"/>
+              </w:rPr>
+              <w:t>{{.Materi}}</w:t>
+            </w:r>
+          </w:p>
+        </w:tc>
+        <w:tc>
+          <w:tcPr>
+            <w:tcW w:w="1455" w:type="dxa"/>
+            <w:vAlign w:val="center"/>
+          </w:tcPr>
+          <w:p>
+            <w:pPr>
+              <w:pStyle w:val="TableParagraph"/>
+              <w:spacing w:before="75"/>
+              <w:ind w:left="0"/>
+              <w:jc w:val="center"/>
+              <w:rPr>
+                <w:sz w:val="16"/>
+              </w:rPr>
+            </w:pPr>
+            <w:r>
+              <w:rPr>
+                <w:sz w:val="16"/>
+              </w:rPr>
+              <w:t>{{.Metode}}</w:t>
+            </w:r>
+          </w:p>
+        </w:tc>
+        <w:tc>
+          <w:tcPr>
+            <w:tcW w:w="675" w:type="dxa"/>
+            <w:vAlign w:val="center"/>
+          </w:tcPr>
+          <w:p>
+            <w:pPr>
+              <w:pStyle w:val="TableParagraph"/>
+              <w:spacing w:before="56"/>
+              <w:ind w:left="0"/>
+              <w:jc w:val="center"/>
+              <w:rPr>
+                <w:sz w:val="16"/>
+              </w:rPr>
+            </w:pPr>
+            <w:r>
+              <w:rPr>
+                <w:sz w:val="16"/>
+              </w:rPr>
+              <w:t>{{.Waktu}}</w:t>
+            </w:r>
+          </w:p>
+        </w:tc>
+        <w:tc>
+          <w:tcPr>
+            <w:tcW w:w="1530" w:type="dxa"/>
+            <w:vAlign w:val="center"/>
+          </w:tcPr>
+          <w:p>
+            <w:pPr>
+              <w:pStyle w:val="TableParagraph"/>
+              <w:spacing w:before="75"/>
+              <w:ind w:left="0"/>
+              <w:jc w:val="center"/>
+              <w:rPr>
+                <w:sz w:val="16"/>
+              </w:rPr>
+            </w:pPr>
+            <w:r>
+              <w:rPr>
+                <w:sz w:val="16"/>
+              </w:rPr>
+              <w:t>{{.Penilaian}}</w:t>
+            </w:r>
+          </w:p>
+        </w:tc>
+        <w:tc>
+          <w:tcPr>
+            <w:tcW w:w="870" w:type="dxa"/>
+            <w:vAlign w:val="center"/>
           </w:tcPr>
           <w:p>
             <w:pPr>
               <w:pStyle w:val="TableParagraph"/>
               <w:spacing w:line="312" w:lineRule="auto"/>
-              <w:ind w:left="71" w:right="59"/>
-              <w:jc w:val="center"/>
-              <w:rPr>
-                <w:b/>
-                <w:sz w:val="20"/>
-              </w:rPr>
-            </w:pPr>
-            <w:r>
-              <w:rPr>
-                <w:b/>
-                <w:spacing w:val="-4"/>
-                <w:sz w:val="20"/>
-              </w:rPr>
-              <w:t xml:space="preserve">{{. </w:t>
-            </w:r>
-            <w:r>
-              <w:rPr>
-                <w:b/>
-                <w:spacing w:val="-10"/>
-                <w:sz w:val="20"/>
-              </w:rPr>
-              <w:t>M</w:t>
-            </w:r>
-          </w:p>
-          <w:p>
-            <w:pPr>
-              <w:pStyle w:val="TableParagraph"/>
-              <w:spacing w:before="2" w:line="312" w:lineRule="auto"/>
-              <w:ind w:left="137" w:right="125" w:firstLine="16"/>
-              <w:jc w:val="both"/>
-              <w:rPr>
-                <w:b/>
-                <w:sz w:val="20"/>
-              </w:rPr>
-            </w:pPr>
-            <w:r>
-              <w:rPr>
-                <w:b/>
-                <w:spacing w:val="-6"/>
-                <w:sz w:val="20"/>
-              </w:rPr>
-              <w:t xml:space="preserve">in gg </w:t>
-            </w:r>
-            <w:r>
-              <w:rPr>
-                <w:b/>
-                <w:spacing w:val="-5"/>
-                <w:sz w:val="20"/>
-              </w:rPr>
-              <w:t>u}</w:t>
-            </w:r>
-          </w:p>
-          <w:p>
-            <w:pPr>
-              <w:pStyle w:val="TableParagraph"/>
-              <w:spacing w:before="3"/>
-              <w:ind w:left="71" w:right="62"/>
-              <w:jc w:val="center"/>
-              <w:rPr>
-                <w:b/>
-                <w:sz w:val="20"/>
-              </w:rPr>
-            </w:pPr>
-            <w:r>
-              <w:rPr>
-                <w:b/>
-                <w:spacing w:val="-10"/>
-                <w:sz w:val="20"/>
-              </w:rPr>
-              <w:t>}</w:t>
-            </w:r>
-          </w:p>
-        </w:tc>
-        <w:tc>
-          <w:tcPr>
-            <w:tcW w:w="1740" w:type="dxa"/>
-          </w:tcPr>
-          <w:p>
-            <w:pPr>
-              <w:pStyle w:val="TableParagraph"/>
-              <w:spacing w:before="75"/>
-              <w:ind w:left="125"/>
-              <w:rPr>
-                <w:sz w:val="16"/>
-              </w:rPr>
-            </w:pPr>
-            <w:r>
-              <w:rPr>
-                <w:spacing w:val="-2"/>
-                <w:sz w:val="16"/>
-              </w:rPr>
-              <w:t>{{.SubCPMK}}</w:t>
-            </w:r>
-          </w:p>
-        </w:tc>
-        <w:tc>
-          <w:tcPr>
-            <w:tcW w:w="1335" w:type="dxa"/>
-          </w:tcPr>
-          <w:p>
-            <w:pPr>
-              <w:pStyle w:val="TableParagraph"/>
-              <w:spacing w:before="75"/>
-              <w:ind w:left="120"/>
-              <w:rPr>
-                <w:sz w:val="16"/>
-              </w:rPr>
-            </w:pPr>
-            <w:r>
-              <w:rPr>
-                <w:spacing w:val="-2"/>
-                <w:sz w:val="16"/>
-              </w:rPr>
-              <w:t>{{.Indikator}}</w:t>
-            </w:r>
-          </w:p>
-        </w:tc>
-        <w:tc>
-          <w:tcPr>
-            <w:tcW w:w="1545" w:type="dxa"/>
-          </w:tcPr>
-          <w:p>
-            <w:pPr>
-              <w:pStyle w:val="TableParagraph"/>
-              <w:spacing w:before="75"/>
-              <w:ind w:left="134"/>
-              <w:rPr>
-                <w:sz w:val="16"/>
-              </w:rPr>
-            </w:pPr>
-            <w:r>
-              <w:rPr>
-                <w:spacing w:val="-2"/>
-                <w:sz w:val="16"/>
-              </w:rPr>
-              <w:t>{{.Materi}}</w:t>
-            </w:r>
-          </w:p>
-        </w:tc>
-        <w:tc>
-          <w:tcPr>
-            <w:tcW w:w="1455" w:type="dxa"/>
-          </w:tcPr>
-          <w:p>
-            <w:pPr>
-              <w:pStyle w:val="TableParagraph"/>
-              <w:spacing w:before="75"/>
-              <w:ind w:left="131"/>
-              <w:rPr>
-                <w:sz w:val="16"/>
-              </w:rPr>
-            </w:pPr>
-            <w:r>
-              <w:rPr>
-                <w:spacing w:val="-2"/>
-                <w:sz w:val="16"/>
-              </w:rPr>
-              <w:t>{{.Metode}}</w:t>
-            </w:r>
-          </w:p>
-        </w:tc>
-        <w:tc>
-          <w:tcPr>
-            <w:tcW w:w="675" w:type="dxa"/>
-          </w:tcPr>
-          <w:p>
-            <w:pPr>
-              <w:pStyle w:val="TableParagraph"/>
-              <w:spacing w:before="75"/>
-              <w:ind w:left="129"/>
-              <w:rPr>
-                <w:sz w:val="16"/>
-              </w:rPr>
-            </w:pPr>
-            <w:r>
-              <w:rPr>
-                <w:spacing w:val="-2"/>
-                <w:sz w:val="16"/>
-              </w:rPr>
-              <w:t>{{.Wa</w:t>
-            </w:r>
-          </w:p>
-          <w:p>
-            <w:pPr>
-              <w:pStyle w:val="TableParagraph"/>
-              <w:spacing w:before="56"/>
-              <w:ind w:left="152"/>
-              <w:rPr>
-                <w:sz w:val="16"/>
-              </w:rPr>
-            </w:pPr>
-            <w:r>
-              <w:rPr>
-                <w:spacing w:val="-2"/>
-                <w:sz w:val="16"/>
-              </w:rPr>
-              <w:t>ktu}}</w:t>
-            </w:r>
-          </w:p>
-        </w:tc>
-        <w:tc>
-          <w:tcPr>
-            <w:tcW w:w="1530" w:type="dxa"/>
-          </w:tcPr>
-          <w:p>
-            <w:pPr>
-              <w:pStyle w:val="TableParagraph"/>
-              <w:spacing w:before="75"/>
-              <w:ind w:left="120"/>
-              <w:rPr>
-                <w:sz w:val="16"/>
-              </w:rPr>
-            </w:pPr>
-            <w:r>
-              <w:rPr>
-                <w:spacing w:val="-2"/>
-                <w:sz w:val="16"/>
-              </w:rPr>
-              <w:t>{{.Penilaian}}</w:t>
-            </w:r>
-          </w:p>
-        </w:tc>
-        <w:tc>
-          <w:tcPr>
-            <w:tcW w:w="870" w:type="dxa"/>
-          </w:tcPr>
-          <w:p>
-            <w:pPr>
-              <w:pStyle w:val="TableParagraph"/>
-              <w:spacing w:line="312" w:lineRule="auto"/>
-              <w:ind w:left="265" w:right="120" w:hanging="114"/>
-              <w:rPr>
-                <w:sz w:val="20"/>
-              </w:rPr>
-            </w:pPr>
-            <w:r>
-              <w:rPr>
-                <w:spacing w:val="-2"/>
-                <w:sz w:val="20"/>
-              </w:rPr>
-              <w:t xml:space="preserve">{{.Bob </w:t>
-            </w:r>
-            <w:r>
-              <w:rPr>
-                <w:spacing w:val="-4"/>
-                <w:sz w:val="20"/>
-              </w:rPr>
-              <w:t>ot}}</w:t>
+              <w:ind w:left="0" w:right="120"/>
+              <w:jc w:val="center"/>
+              <w:rPr>
+                <w:sz w:val="20"/>
+              </w:rPr>
+            </w:pPr>
+            <w:r>
+              <w:rPr>
+                <w:sz w:val="20"/>
+              </w:rPr>
+              <w:t>{{.Bobot}}</w:t>
             </w:r>
           </w:p>
         </w:tc>
@@ -3984,7 +3324,7 @@
       </w:r>
       <w:r>
         <w:rPr>
-          <w:spacing w:val="-2"/>
+          <w:spacing w:val="-1"/>
         </w:rPr>
         <w:t>{{.TugasKe}}</w:t>
       </w:r>
@@ -5569,28 +4909,7 @@
         <w:ind w:left="570"/>
       </w:pPr>
       <w:r>
-        <w:t>{{range</w:t>
-      </w:r>
-      <w:r>
-        <w:rPr>
-          <w:spacing w:val="-1"/>
-        </w:rPr>
-        <w:t xml:space="preserve"> </w:t>
-      </w:r>
-      <w:r>
-        <w:t>.AnalisisKetercapaian}}</w:t>
-      </w:r>
-      <w:r>
-        <w:rPr>
-          <w:spacing w:val="-1"/>
-        </w:rPr>
-        <w:t xml:space="preserve"> </w:t>
-      </w:r>
-      <w:r>
-        <w:rPr>
-          <w:spacing w:val="-2"/>
-        </w:rPr>
-        <w:t>{{end}}</w:t>
+        <w:t>{{range .AnalisisKetercapaian}} {{end}}</w:t>
       </w:r>
     </w:p>
     <w:tbl>
@@ -5812,26 +5131,8 @@
         <w:tc>
           <w:tcPr>
             <w:tcW w:w="795" w:type="dxa"/>
-          </w:tcPr>
-          <w:p>
-            <w:pPr>
-              <w:pStyle w:val="TableParagraph"/>
-              <w:ind w:left="16"/>
-              <w:jc w:val="center"/>
-              <w:rPr>
-                <w:b/>
-                <w:sz w:val="20"/>
-              </w:rPr>
-            </w:pPr>
-            <w:r>
-              <w:rPr>
-                <w:b/>
-                <w:spacing w:val="-2"/>
-                <w:sz w:val="20"/>
-              </w:rPr>
-              <w:t>{{.Mi</w:t>
-            </w:r>
-          </w:p>
+            <w:vAlign w:val="center"/>
+          </w:tcPr>
           <w:p>
             <w:pPr>
               <w:pStyle w:val="TableParagraph"/>
@@ -5846,50 +5147,29 @@
             <w:r>
               <w:rPr>
                 <w:b/>
-                <w:spacing w:val="-2"/>
-                <w:sz w:val="20"/>
-              </w:rPr>
-              <w:t>nggu}</w:t>
-            </w:r>
-          </w:p>
-          <w:p>
-            <w:pPr>
-              <w:pStyle w:val="TableParagraph"/>
-              <w:spacing w:before="70"/>
-              <w:ind w:left="16" w:right="1"/>
-              <w:jc w:val="center"/>
-              <w:rPr>
-                <w:b/>
-                <w:sz w:val="20"/>
-              </w:rPr>
-            </w:pPr>
-            <w:r>
-              <w:rPr>
-                <w:b/>
-                <w:spacing w:val="-10"/>
-                <w:sz w:val="20"/>
-              </w:rPr>
-              <w:t>}</w:t>
+                <w:sz w:val="20"/>
+              </w:rPr>
+              <w:t>{{.Minggu}}</w:t>
             </w:r>
           </w:p>
         </w:tc>
         <w:tc>
           <w:tcPr>
             <w:tcW w:w="1215" w:type="dxa"/>
+            <w:vAlign w:val="center"/>
           </w:tcPr>
           <w:p>
             <w:pPr>
               <w:pStyle w:val="TableParagraph"/>
               <w:spacing w:before="75"/>
               <w:ind w:left="0" w:right="425"/>
-              <w:jc w:val="right"/>
+              <w:jc w:val="center"/>
               <w:rPr>
                 <w:sz w:val="16"/>
               </w:rPr>
             </w:pPr>
             <w:r>
               <w:rPr>
-                <w:spacing w:val="-2"/>
                 <w:sz w:val="16"/>
               </w:rPr>
               <w:t>{{.CPL}}</w:t>
@@ -5899,20 +5179,20 @@
         <w:tc>
           <w:tcPr>
             <w:tcW w:w="1200" w:type="dxa"/>
+            <w:vAlign w:val="center"/>
           </w:tcPr>
           <w:p>
             <w:pPr>
               <w:pStyle w:val="TableParagraph"/>
               <w:spacing w:before="75"/>
               <w:ind w:left="0" w:right="261"/>
-              <w:jc w:val="right"/>
+              <w:jc w:val="center"/>
               <w:rPr>
                 <w:sz w:val="16"/>
               </w:rPr>
             </w:pPr>
             <w:r>
               <w:rPr>
-                <w:spacing w:val="-2"/>
                 <w:sz w:val="16"/>
               </w:rPr>
               <w:t>{{.CPMK}}</w:t>
@@ -5922,19 +5202,20 @@
         <w:tc>
           <w:tcPr>
             <w:tcW w:w="1500" w:type="dxa"/>
+            <w:vAlign w:val="center"/>
           </w:tcPr>
           <w:p>
             <w:pPr>
               <w:pStyle w:val="TableParagraph"/>
               <w:spacing w:before="75"/>
-              <w:ind w:left="126"/>
+              <w:ind w:left="0"/>
+              <w:jc w:val="center"/>
               <w:rPr>
                 <w:sz w:val="16"/>
               </w:rPr>
             </w:pPr>
             <w:r>
               <w:rPr>
-                <w:spacing w:val="-2"/>
                 <w:sz w:val="16"/>
               </w:rPr>
               <w:t>{{.SubCPMK}}</w:t>
@@ -5944,19 +5225,20 @@
         <w:tc>
           <w:tcPr>
             <w:tcW w:w="2310" w:type="dxa"/>
+            <w:vAlign w:val="center"/>
           </w:tcPr>
           <w:p>
             <w:pPr>
               <w:pStyle w:val="TableParagraph"/>
               <w:spacing w:before="75"/>
-              <w:ind w:left="131"/>
+              <w:ind w:left="0"/>
+              <w:jc w:val="center"/>
               <w:rPr>
                 <w:sz w:val="16"/>
               </w:rPr>
             </w:pPr>
             <w:r>
               <w:rPr>
-                <w:spacing w:val="-2"/>
                 <w:sz w:val="16"/>
               </w:rPr>
               <w:t>{{.TopikMateri}}</w:t>
@@ -5966,20 +5248,20 @@
         <w:tc>
           <w:tcPr>
             <w:tcW w:w="1815" w:type="dxa"/>
+            <w:vAlign w:val="center"/>
           </w:tcPr>
           <w:p>
             <w:pPr>
               <w:pStyle w:val="TableParagraph"/>
               <w:spacing w:before="75"/>
               <w:ind w:left="0" w:right="290"/>
-              <w:jc w:val="right"/>
+              <w:jc w:val="center"/>
               <w:rPr>
                 <w:sz w:val="16"/>
               </w:rPr>
             </w:pPr>
             <w:r>
               <w:rPr>
-                <w:spacing w:val="-2"/>
                 <w:sz w:val="16"/>
               </w:rPr>
               <w:t>{{.JenisAssessmen}}</w:t>
@@ -5989,38 +5271,23 @@
         <w:tc>
           <w:tcPr>
             <w:tcW w:w="795" w:type="dxa"/>
-          </w:tcPr>
-          <w:p>
-            <w:pPr>
-              <w:pStyle w:val="TableParagraph"/>
-              <w:ind w:left="158"/>
-              <w:rPr>
-                <w:sz w:val="20"/>
-              </w:rPr>
-            </w:pPr>
-            <w:r>
-              <w:rPr>
-                <w:spacing w:val="-2"/>
-                <w:sz w:val="20"/>
-              </w:rPr>
-              <w:t>{{.Bo</w:t>
-            </w:r>
-          </w:p>
+            <w:vAlign w:val="center"/>
+          </w:tcPr>
           <w:p>
             <w:pPr>
               <w:pStyle w:val="TableParagraph"/>
               <w:spacing w:before="70"/>
-              <w:ind w:left="172"/>
-              <w:rPr>
-                <w:sz w:val="20"/>
-              </w:rPr>
-            </w:pPr>
-            <w:r>
-              <w:rPr>
-                <w:spacing w:val="-2"/>
-                <w:sz w:val="20"/>
-              </w:rPr>
-              <w:t>bot}}</w:t>
+              <w:ind w:left="0"/>
+              <w:jc w:val="center"/>
+              <w:rPr>
+                <w:sz w:val="20"/>
+              </w:rPr>
+            </w:pPr>
+            <w:r>
+              <w:rPr>
+                <w:sz w:val="20"/>
+              </w:rPr>
+              <w:t>{{.Bobot}}</w:t>
             </w:r>
           </w:p>
         </w:tc>
@@ -7520,7 +6787,7 @@
           </mc:Choice>
           <mc:Fallback>
             <w:pict>
-              <v:group w14:anchorId="059F2262" id="Group 8" o:spid="_x0000_s1026" style="width:168pt;height:.75pt;mso-position-horizontal-relative:char;mso-position-vertical-relative:line" coordsize="21336,95" o:gfxdata="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">
+              <v:group w14:anchorId="7C84AD90" id="Group 8" o:spid="_x0000_s1026" style="width:168pt;height:.75pt;mso-position-horizontal-relative:char;mso-position-vertical-relative:line" coordsize="21336,95" o:gfxdata="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">
                 <v:shape id="Graphic 9" o:spid="_x0000_s1027" style="position:absolute;width:21336;height:95;visibility:visible;mso-wrap-style:square;v-text-anchor:top" coordsize="2133600,9525" o:gfxdata="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" path="m2133599,9524l,9524,,,2133599,r,9524xe" fillcolor="black" stroked="f">
                   <v:path arrowok="t"/>
                 </v:shape>
@@ -7709,7 +6976,7 @@
           </mc:Choice>
           <mc:Fallback>
             <w:pict>
-              <v:shape w14:anchorId="3D399A29" id="Graphic 10" o:spid="_x0000_s1026" style="position:absolute;margin-left:341.25pt;margin-top:16.35pt;width:168pt;height:.75pt;z-index:-15727616;visibility:visible;mso-wrap-style:square;mso-wrap-distance-left:0;mso-wrap-distance-top:0;mso-wrap-distance-right:0;mso-wrap-distance-bottom:0;mso-position-horizontal:absolute;mso-position-horizontal-relative:page;mso-position-vertical:absolute;mso-position-vertical-relative:text;v-text-anchor:top" coordsize="2133600,9525" o:gfxdata="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" path="m2133599,9524l,9524,,,2133599,r,9524xe" fillcolor="black" stroked="f">
+              <v:shape w14:anchorId="48000AC0" id="Graphic 10" o:spid="_x0000_s1026" style="position:absolute;margin-left:341.25pt;margin-top:16.35pt;width:168pt;height:.75pt;z-index:-15727616;visibility:visible;mso-wrap-style:square;mso-wrap-distance-left:0;mso-wrap-distance-top:0;mso-wrap-distance-right:0;mso-wrap-distance-bottom:0;mso-position-horizontal:absolute;mso-position-horizontal-relative:page;mso-position-vertical:absolute;mso-position-vertical-relative:text;v-text-anchor:top" coordsize="2133600,9525" o:gfxdata="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" path="m2133599,9524l,9524,,,2133599,r,9524xe" fillcolor="black" stroked="f">
                 <v:path arrowok="t"/>
                 <w10:wrap type="topAndBottom" anchorx="page"/>
               </v:shape>
@@ -7939,7 +7206,7 @@
           </mc:Choice>
           <mc:Fallback>
             <w:pict>
-              <v:shape w14:anchorId="299AEBE2" id="Graphic 11" o:spid="_x0000_s1026" style="position:absolute;margin-left:214.5pt;margin-top:16.35pt;width:168pt;height:.75pt;z-index:-15727104;visibility:visible;mso-wrap-style:square;mso-wrap-distance-left:0;mso-wrap-distance-top:0;mso-wrap-distance-right:0;mso-wrap-distance-bottom:0;mso-position-horizontal:absolute;mso-position-horizontal-relative:page;mso-position-vertical:absolute;mso-position-vertical-relative:text;v-text-anchor:top" coordsize="2133600,9525" o:gfxdata="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" path="m2133599,9524l,9524,,,2133599,r,9524xe" fillcolor="black" stroked="f">
+              <v:shape w14:anchorId="59C5855B" id="Graphic 11" o:spid="_x0000_s1026" style="position:absolute;margin-left:214.5pt;margin-top:16.35pt;width:168pt;height:.75pt;z-index:-15727104;visibility:visible;mso-wrap-style:square;mso-wrap-distance-left:0;mso-wrap-distance-top:0;mso-wrap-distance-right:0;mso-wrap-distance-bottom:0;mso-position-horizontal:absolute;mso-position-horizontal-relative:page;mso-position-vertical:absolute;mso-position-vertical-relative:text;v-text-anchor:top" coordsize="2133600,9525" o:gfxdata="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" path="m2133599,9524l,9524,,,2133599,r,9524xe" fillcolor="black" stroked="f">
                 <v:path arrowok="t"/>
                 <w10:wrap type="topAndBottom" anchorx="page"/>
               </v:shape>
@@ -8498,7 +7765,6 @@
   <w:style w:type="character" w:default="1" w:styleId="DefaultParagraphFont">
     <w:name w:val="Default Paragraph Font"/>
     <w:uiPriority w:val="1"/>
-    <w:semiHidden/>
     <w:unhideWhenUsed/>
   </w:style>
   <w:style w:type="table" w:default="1" w:styleId="TableNormal">

</xml_diff>